<commit_message>
Fix typo in survey paper title for clarity
</commit_message>
<xml_diff>
--- a/Documentation/Survey Paper/Survey-paper.docx
+++ b/Documentation/Survey Paper/Survey-paper.docx
@@ -361,16 +361,7 @@
                             <w:sz w:val="18"/>
                             <w:szCs w:val="18"/>
                           </w:rPr>
-                          <w:t>Vignesh P</w:t>
-                        </w:r>
-                        <w:r>
-                          <w:rPr>
-                            <w:b/>
-                            <w:bCs/>
-                            <w:sz w:val="18"/>
-                            <w:szCs w:val="18"/>
-                          </w:rPr>
-                          <w:t xml:space="preserve">                                                           </w:t>
+                          <w:t xml:space="preserve">Vignesh P                                                           </w:t>
                         </w:r>
                         <w:r>
                           <w:rPr>
@@ -586,6 +577,12 @@
         </w:rPr>
         <w:t>Implementation of a Secure DevOps CI/CD Pipeline Using DevSecOps Too</w:t>
       </w:r>
+      <w:r>
+        <w:rPr>
+          <w:kern w:val="48"/>
+        </w:rPr>
+        <w:t>ls</w:t>
+      </w:r>
     </w:p>
     <w:p>
       <w:pPr>
@@ -643,23 +640,7 @@
         <w:t>—</w:t>
       </w:r>
       <w:r>
-        <w:t xml:space="preserve">The rapid growth of software development has increased the need for faster and more secure deployment practices. DevOps enables continuous integration and continuous delivery of applications, but security vulnerabilities may arise if security is not integrated into the pipeline. </w:t>
-      </w:r>
-      <w:proofErr w:type="spellStart"/>
-      <w:r>
-        <w:t>DevSecOps</w:t>
-      </w:r>
-      <w:proofErr w:type="spellEnd"/>
-      <w:r>
-        <w:t xml:space="preserve"> integrates security practices into every phase of the DevOps lifecycle to ensure secure software development and deployment. This paper presents the implementation of a Secure DevOps CI/CD pipeline that integrates security scanning, containerization, and continuous monitoring. The proposed system uses tools such as Git, GitHub, Jenkins, Docker, Kubernetes, Terraform, SonarQube, OWASP ZAP, </w:t>
-      </w:r>
-      <w:proofErr w:type="spellStart"/>
-      <w:r>
-        <w:t>Trivy</w:t>
-      </w:r>
-      <w:proofErr w:type="spellEnd"/>
-      <w:r>
-        <w:t>, Prometheus, and Grafana to automate the development and security processes. The pipeline detects vulnerabilities early in the development lifecycle and provides continuous monitoring to improve application security and reliability.</w:t>
+        <w:t>The rapid growth of software development has increased the need for faster and more secure deployment practices. DevOps enables continuous integration and continuous delivery of applications, but security vulnerabilities may arise if security is not integrated into the pipeline. DevSecOps integrates security practices into every phase of the DevOps lifecycle to ensure secure software development and deployment. This paper presents the implementation of a Secure DevOps CI/CD pipeline that integrates security scanning, containerization, and continuous monitoring. The proposed system uses tools such as Git, GitHub, Jenkins, Docker, Kubernetes, Terraform, SonarQube, OWASP ZAP, Trivy, Prometheus, and Grafana to automate the development and security processes. The pipeline detects vulnerabilities early in the development lifecycle and provides continuous monitoring to improve application security and reliability.</w:t>
       </w:r>
     </w:p>
     <w:p>
@@ -680,15 +661,7 @@
         <w:t xml:space="preserve"> </w:t>
       </w:r>
       <w:r>
-        <w:t xml:space="preserve">DevOps, </w:t>
-      </w:r>
-      <w:proofErr w:type="spellStart"/>
-      <w:r>
-        <w:t>DevSecOps</w:t>
-      </w:r>
-      <w:proofErr w:type="spellEnd"/>
-      <w:r>
-        <w:t>, CI/CD Pipeline, Security Automation, Vulnerability Scanning</w:t>
+        <w:t>DevOps, DevSecOps, CI/CD Pipeline, Security Automation, Vulnerability Scanning</w:t>
       </w:r>
     </w:p>
     <w:p>
@@ -732,21 +705,7 @@
         <w:rPr>
           <w:lang w:val="en-US"/>
         </w:rPr>
-        <w:t xml:space="preserve">However, traditional DevOps pipelines often overlook security concerns, which may lead to vulnerabilities in deployed applications. To address this problem, </w:t>
-      </w:r>
-      <w:proofErr w:type="spellStart"/>
-      <w:r>
-        <w:rPr>
-          <w:lang w:val="en-US"/>
-        </w:rPr>
-        <w:t>DevSecOps</w:t>
-      </w:r>
-      <w:proofErr w:type="spellEnd"/>
-      <w:r>
-        <w:rPr>
-          <w:lang w:val="en-US"/>
-        </w:rPr>
-        <w:t xml:space="preserve"> integrates security practices directly into the DevOps pipeline. By embedding security tools and automated vulnerability scanning into the development lifecycle, organizations can detect and mitigate security risks early.</w:t>
+        <w:t>However, traditional DevOps pipelines often overlook security concerns, which may lead to vulnerabilities in deployed applications. To address this problem, DevSecOps integrates security practices directly into the DevOps pipeline. By embedding security tools and automated vulnerability scanning into the development lifecycle, organizations can detect and mitigate security risks early.</w:t>
       </w:r>
     </w:p>
     <w:p>
@@ -3695,6 +3654,7 @@
   <w:style w:type="character" w:default="1" w:styleId="DefaultParagraphFont">
     <w:name w:val="Default Paragraph Font"/>
     <w:uiPriority w:val="1"/>
+    <w:semiHidden/>
     <w:unhideWhenUsed/>
   </w:style>
   <w:style w:type="table" w:default="1" w:styleId="TableNormal">

</xml_diff>

<commit_message>
Refine survey paper content and formatting for clarity and consistency
</commit_message>
<xml_diff>
--- a/Documentation/Survey Paper/Survey-paper.docx
+++ b/Documentation/Survey Paper/Survey-paper.docx
@@ -810,76 +810,6 @@
       </w:r>
       <w:r>
         <w:tab/>
-      </w:r>
-    </w:p>
-    <w:p>
-      <w:pPr>
-        <w:pStyle w:val="equation"/>
-      </w:pPr>
-      <w:r>
-        <w:rPr>
-          <w:rFonts w:ascii="Times New Roman" w:hAnsi="Times New Roman" w:cs="Times New Roman"/>
-          <w:i/>
-        </w:rPr>
-        <w:t>a</w:t>
-      </w:r>
-      <w:r>
-        <w:t></w:t>
-      </w:r>
-      <w:r>
-        <w:t></w:t>
-      </w:r>
-      <w:r>
-        <w:t></w:t>
-      </w:r>
-      <w:r>
-        <w:rPr>
-          <w:rFonts w:ascii="Times New Roman" w:hAnsi="Times New Roman" w:cs="Times New Roman"/>
-          <w:i/>
-        </w:rPr>
-        <w:t>b</w:t>
-      </w:r>
-      <w:r>
-        <w:t></w:t>
-      </w:r>
-      <w:r>
-        <w:t></w:t>
-      </w:r>
-      <w:r>
-        <w:t></w:t>
-      </w:r>
-      <w:r>
-        <w:t></w:t>
-      </w:r>
-      <w:r>
-        <w:t></w:t>
-      </w:r>
-      <w:r>
-        <w:tab/>
-      </w:r>
-      <w:r>
-        <w:t></w:t>
-      </w:r>
-      <w:r>
-        <w:t></w:t>
-      </w:r>
-      <w:r>
-        <w:t></w:t>
-      </w:r>
-    </w:p>
-    <w:p>
-      <w:pPr>
-        <w:pStyle w:val="equation"/>
-        <w:jc w:val="both"/>
-        <w:rPr>
-          <w:rFonts w:ascii="Times New Roman" w:hAnsi="Times New Roman" w:cs="Times New Roman"/>
-        </w:rPr>
-      </w:pPr>
-      <w:r>
-        <w:rPr>
-          <w:rFonts w:ascii="Times New Roman" w:hAnsi="Times New Roman" w:cs="Times New Roman"/>
-        </w:rPr>
-        <w:t>Equation (1) represents a general expression example used for formatting equations in IEEE papers.</w:t>
       </w:r>
     </w:p>
     <w:p>
@@ -1350,14 +1280,12 @@
           <w:ilvl w:val="0"/>
           <w:numId w:val="0"/>
         </w:numPr>
+        <w:jc w:val="center"/>
         <w:rPr>
           <w:i w:val="0"/>
           <w:iCs w:val="0"/>
         </w:rPr>
       </w:pPr>
-      <w:r>
-        <w:t xml:space="preserve">                                                                               </w:t>
-      </w:r>
     </w:p>
     <w:p>
       <w:pPr>
@@ -1401,17 +1329,15 @@
       </w:r>
     </w:p>
     <w:p/>
-    <w:p/>
     <w:p>
       <w:r>
         <w:rPr>
           <w:noProof/>
         </w:rPr>
-        <w:lastRenderedPageBreak/>
         <w:drawing>
-          <wp:inline distT="0" distB="0" distL="0" distR="0" wp14:anchorId="1D145E74" wp14:editId="62657E1A">
-            <wp:extent cx="3067291" cy="2044861"/>
-            <wp:effectExtent l="0" t="0" r="0" b="6350"/>
+          <wp:inline distT="0" distB="0" distL="0" distR="0" wp14:anchorId="1D145E74" wp14:editId="26A2431E">
+            <wp:extent cx="2515921" cy="1677281"/>
+            <wp:effectExtent l="0" t="0" r="0" b="0"/>
             <wp:docPr id="125373172" name="Picture 5"/>
             <wp:cNvGraphicFramePr>
               <a:graphicFrameLocks xmlns:a="http://purl.oclc.org/ooxml/drawingml/main" noChangeAspect="1"/>
@@ -1438,7 +1364,7 @@
                   <pic:spPr>
                     <a:xfrm>
                       <a:off x="0" y="0"/>
-                      <a:ext cx="3067291" cy="2044861"/>
+                      <a:ext cx="2521920" cy="1681281"/>
                     </a:xfrm>
                     <a:prstGeom prst="rect">
                       <a:avLst/>
@@ -1454,6 +1380,7 @@
     <w:p>
       <w:pPr>
         <w:pStyle w:val="figurecaption"/>
+        <w:jc w:val="center"/>
       </w:pPr>
       <w:r>
         <w:t>DevSecOps CI/CD pipeline architecture.</w:t>
@@ -1474,6 +1401,7 @@
           <w:b/>
           <w:bCs/>
         </w:rPr>
+        <w:lastRenderedPageBreak/>
         <w:t>Security Best Practices</w:t>
       </w:r>
       <w:r>
@@ -1560,64 +1488,69 @@
     </w:p>
     <w:p>
       <w:pPr>
+        <w:pStyle w:val="Heading2"/>
         <w:rPr>
           <w:b/>
           <w:bCs/>
-          <w:lang w:val="en-IN"/>
-        </w:rPr>
-      </w:pPr>
+        </w:rPr>
+      </w:pPr>
+      <w:r>
+        <w:rPr>
+          <w:b/>
+          <w:bCs/>
+        </w:rPr>
+        <w:t>Deployment in Cloud Environment</w:t>
+      </w:r>
     </w:p>
     <w:p>
       <w:pPr>
-        <w:pStyle w:val="Heading2"/>
-        <w:rPr>
-          <w:b/>
-          <w:bCs/>
-        </w:rPr>
-      </w:pPr>
-      <w:r>
-        <w:rPr>
-          <w:b/>
-          <w:bCs/>
-        </w:rPr>
-        <w:t>Deployment in Cloud Environment</w:t>
+        <w:pStyle w:val="BodyText"/>
+        <w:ind w:firstLine="0pt"/>
+        <w:rPr>
+          <w:lang w:val="en-US"/>
+        </w:rPr>
+      </w:pPr>
+      <w:r>
+        <w:rPr>
+          <w:lang w:val="en-US"/>
+        </w:rPr>
+        <w:t xml:space="preserve">Cloud platforms such as Microsoft Azure or AWS are used to host the infrastructure required for the DevOps pipeline. Infrastructure as Code tools like Terraform automate the provisioning of cloud resources, enabling scalable and consistent infrastructure deployment. By combining cloud computing with </w:t>
+      </w:r>
+      <w:proofErr w:type="spellStart"/>
+      <w:r>
+        <w:rPr>
+          <w:lang w:val="en-US"/>
+        </w:rPr>
+        <w:t>DevSecOps</w:t>
+      </w:r>
+      <w:proofErr w:type="spellEnd"/>
+      <w:r>
+        <w:rPr>
+          <w:lang w:val="en-US"/>
+        </w:rPr>
+        <w:t xml:space="preserve"> practices, organizations can achieve secure, reliable, and automated software delivery.</w:t>
       </w:r>
     </w:p>
     <w:p>
       <w:pPr>
-        <w:pStyle w:val="BodyText"/>
-        <w:ind w:firstLine="0pt"/>
-        <w:rPr>
-          <w:lang w:val="en-US"/>
-        </w:rPr>
-      </w:pPr>
-      <w:r>
-        <w:rPr>
-          <w:lang w:val="en-US"/>
-        </w:rPr>
-        <w:t xml:space="preserve">Cloud platforms such as Microsoft Azure or AWS are used to host the infrastructure required for the DevOps pipeline. Infrastructure as Code tools like Terraform automate the provisioning of cloud resources, enabling scalable and consistent infrastructure deployment. By combining cloud computing with </w:t>
-      </w:r>
-      <w:proofErr w:type="spellStart"/>
-      <w:r>
-        <w:rPr>
-          <w:lang w:val="en-US"/>
-        </w:rPr>
-        <w:t>DevSecOps</w:t>
-      </w:r>
-      <w:proofErr w:type="spellEnd"/>
-      <w:r>
-        <w:rPr>
-          <w:lang w:val="en-US"/>
-        </w:rPr>
-        <w:t xml:space="preserve"> practices, organizations can achieve secure, reliable, and automated software delivery.</w:t>
+        <w:pStyle w:val="Heading1"/>
+      </w:pPr>
+      <w:r>
+        <w:t>This Is Another Level 1 Heading</w:t>
       </w:r>
     </w:p>
     <w:p>
       <w:pPr>
-        <w:pStyle w:val="Heading1"/>
-      </w:pPr>
-      <w:r>
-        <w:t>This Is Another Level 1 Heading</w:t>
+        <w:pStyle w:val="BodyText"/>
+        <w:rPr>
+          <w:lang w:val="en-US"/>
+        </w:rPr>
+      </w:pPr>
+      <w:r>
+        <w:rPr>
+          <w:lang w:val="en-US"/>
+        </w:rPr>
+        <w:t>All the headings in the main body of your paper are numbered (automatically).</w:t>
       </w:r>
     </w:p>
     <w:p>
@@ -1631,35 +1564,7 @@
         <w:rPr>
           <w:lang w:val="en-US"/>
         </w:rPr>
-        <w:t>All the headings in the main body of your paper are numbered (automatically).</w:t>
-      </w:r>
-    </w:p>
-    <w:p>
-      <w:pPr>
-        <w:pStyle w:val="BodyText"/>
-        <w:rPr>
-          <w:lang w:val="en-US"/>
-        </w:rPr>
-      </w:pPr>
-      <w:r>
-        <w:rPr>
-          <w:lang w:val="en-US"/>
-        </w:rPr>
-        <w:t xml:space="preserve">Another type of heading is the “component heading”, which is used for other </w:t>
-      </w:r>
-      <w:proofErr w:type="gramStart"/>
-      <w:r>
-        <w:rPr>
-          <w:lang w:val="en-US"/>
-        </w:rPr>
-        <w:t>components  that</w:t>
-      </w:r>
-      <w:proofErr w:type="gramEnd"/>
-      <w:r>
-        <w:rPr>
-          <w:lang w:val="en-US"/>
-        </w:rPr>
-        <w:t xml:space="preserve"> aren’t part of the main text. These are usually your acknowledgments and your references, which you can see examples of below. These </w:t>
+        <w:t xml:space="preserve">Another type of heading is the “component heading”, which is used for other components  that aren’t part of the main text. These are usually your acknowledgments and your references, which you can see examples of below. These </w:t>
       </w:r>
       <w:r>
         <w:rPr>
@@ -1748,30 +1653,6 @@
         </w:rPr>
         <w:t>, for her continuous guidance, valuable suggestions, and encouragement throughout the development of this project. Her support and insights have greatly contributed to the successful completion of this work.</w:t>
       </w:r>
-    </w:p>
-    <w:p>
-      <w:pPr>
-        <w:pStyle w:val="BodyText"/>
-        <w:rPr>
-          <w:lang w:val="en-US"/>
-        </w:rPr>
-      </w:pPr>
-    </w:p>
-    <w:p>
-      <w:pPr>
-        <w:pStyle w:val="BodyText"/>
-        <w:rPr>
-          <w:lang w:val="en-US"/>
-        </w:rPr>
-      </w:pPr>
-    </w:p>
-    <w:p>
-      <w:pPr>
-        <w:pStyle w:val="BodyText"/>
-        <w:rPr>
-          <w:lang w:val="en-US"/>
-        </w:rPr>
-      </w:pPr>
     </w:p>
     <w:p>
       <w:pPr>
@@ -4025,6 +3906,7 @@
   <w:style w:type="character" w:default="1" w:styleId="DefaultParagraphFont">
     <w:name w:val="Default Paragraph Font"/>
     <w:uiPriority w:val="1"/>
+    <w:semiHidden/>
     <w:unhideWhenUsed/>
   </w:style>
   <w:style w:type="table" w:default="1" w:styleId="TableNormal">

</xml_diff>

<commit_message>
Update survey paper content for improved clarity and consistency
</commit_message>
<xml_diff>
--- a/Documentation/Survey Paper/Survey-paper.docx
+++ b/Documentation/Survey Paper/Survey-paper.docx
@@ -581,7 +581,13 @@
         <w:rPr>
           <w:kern w:val="48"/>
         </w:rPr>
-        <w:t>ls</w:t>
+        <w:t>l</w:t>
+      </w:r>
+      <w:r>
+        <w:rPr>
+          <w:kern w:val="48"/>
+        </w:rPr>
+        <w:t>s</w:t>
       </w:r>
     </w:p>
     <w:p>
@@ -1550,7 +1556,7 @@
     <w:p>
       <w:pPr>
         <w:spacing w:before="5pt" w:beforeAutospacing="1" w:after="5pt" w:afterAutospacing="1"/>
-        <w:jc w:val="start"/>
+        <w:jc w:val="both"/>
         <w:rPr>
           <w:rFonts w:eastAsia="Times New Roman"/>
         </w:rPr>
@@ -1766,7 +1772,7 @@
     <w:p>
       <w:pPr>
         <w:spacing w:before="5pt" w:beforeAutospacing="1" w:after="5pt" w:afterAutospacing="1"/>
-        <w:jc w:val="start"/>
+        <w:jc w:val="both"/>
         <w:rPr>
           <w:rFonts w:eastAsia="Times New Roman"/>
         </w:rPr>
@@ -4158,6 +4164,7 @@
   <w:style w:type="character" w:default="1" w:styleId="DefaultParagraphFont">
     <w:name w:val="Default Paragraph Font"/>
     <w:uiPriority w:val="1"/>
+    <w:semiHidden/>
     <w:unhideWhenUsed/>
   </w:style>
   <w:style w:type="table" w:default="1" w:styleId="TableNormal">

</xml_diff>

<commit_message>
added the conclusion in the survey paper
</commit_message>
<xml_diff>
--- a/Documentation/Survey Paper/Survey-paper.docx
+++ b/Documentation/Survey Paper/Survey-paper.docx
@@ -1833,40 +1833,6 @@
     </w:p>
     <w:p>
       <w:pPr>
-        <w:spacing w:before="5pt" w:beforeAutospacing="1" w:after="5pt" w:afterAutospacing="1"/>
-        <w:jc w:val="start"/>
-        <w:rPr>
-          <w:rFonts w:eastAsia="Times New Roman"/>
-        </w:rPr>
-      </w:pPr>
-    </w:p>
-    <w:p>
-      <w:pPr>
-        <w:spacing w:before="5pt" w:beforeAutospacing="1" w:after="5pt" w:afterAutospacing="1"/>
-        <w:jc w:val="start"/>
-        <w:rPr>
-          <w:rFonts w:eastAsia="Times New Roman"/>
-        </w:rPr>
-      </w:pPr>
-    </w:p>
-    <w:p>
-      <w:pPr>
-        <w:spacing w:before="5pt" w:beforeAutospacing="1" w:after="5pt" w:afterAutospacing="1"/>
-        <w:jc w:val="start"/>
-        <w:rPr>
-          <w:rFonts w:eastAsia="Times New Roman"/>
-        </w:rPr>
-      </w:pPr>
-      <w:r>
-        <w:rPr>
-          <w:rFonts w:ascii="Segoe UI" w:hAnsi="Segoe UI" w:cs="Segoe UI"/>
-          <w:color w:val="FFFFFF"/>
-        </w:rPr>
-        <w:t>.</w:t>
-      </w:r>
-    </w:p>
-    <w:p>
-      <w:pPr>
         <w:pStyle w:val="Heading5"/>
         <w:jc w:val="both"/>
       </w:pPr>
@@ -1908,7 +1874,13 @@
         <w:rPr>
           <w:lang w:val="en-US"/>
         </w:rPr>
-        <w:t>, for her continuous guidance, valuable suggestions, and encouragement throughout the development of this project. Her support and insights have greatly contributed to the successful completion of this work.</w:t>
+        <w:t xml:space="preserve">, for her continuous guidance, valuable suggestions, and encouragement throughout the development of this project. Her support and </w:t>
+      </w:r>
+      <w:r>
+        <w:rPr>
+          <w:lang w:val="en-US"/>
+        </w:rPr>
+        <w:t>insights have greatly contributed to the successful completion of this work.</w:t>
       </w:r>
     </w:p>
     <w:p>
@@ -2107,6 +2079,121 @@
       </w:r>
       <w:r>
         <w:t>, vol. 14, pp. 4733–4755, 2026, doi: 10.1109/ACCESS.2026.3650793.</w:t>
+      </w:r>
+    </w:p>
+    <w:p>
+      <w:pPr>
+        <w:pStyle w:val="Heading5"/>
+        <w:spacing w:before="12pt"/>
+        <w:rPr>
+          <w:b/>
+          <w:bCs/>
+        </w:rPr>
+      </w:pPr>
+      <w:r>
+        <w:rPr>
+          <w:b/>
+          <w:bCs/>
+        </w:rPr>
+        <w:t>IV.</w:t>
+      </w:r>
+      <w:r>
+        <w:rPr>
+          <w:b/>
+          <w:bCs/>
+        </w:rPr>
+        <w:t>Conclusion</w:t>
+      </w:r>
+    </w:p>
+    <w:p/>
+    <w:p>
+      <w:pPr>
+        <w:pStyle w:val="references"/>
+        <w:numPr>
+          <w:ilvl w:val="0"/>
+          <w:numId w:val="0"/>
+        </w:numPr>
+        <w:spacing w:line="12pt" w:lineRule="auto"/>
+        <w:ind w:start="18pt"/>
+        <w:rPr>
+          <w:bCs/>
+          <w:color w:val="000000" w:themeColor="text1"/>
+          <w:spacing w:val="-1"/>
+          <w:sz w:val="20"/>
+          <w:szCs w:val="20"/>
+          <w:lang w:val="en-IN" w:eastAsia="x-none"/>
+        </w:rPr>
+      </w:pPr>
+      <w:r>
+        <w:rPr>
+          <w:bCs/>
+          <w:color w:val="000000" w:themeColor="text1"/>
+          <w:spacing w:val="-1"/>
+          <w:sz w:val="20"/>
+          <w:szCs w:val="20"/>
+          <w:lang w:val="en-IN" w:eastAsia="x-none"/>
+        </w:rPr>
+        <w:t>This paper presented the implementation of a Secure DevOps (DevSecOps) CI/CD pipeline that integrates security practices into the software development lifecycle. By incorporating automated security tools such as SonarQube, OWASP ZAP, and Trivy, vulnerabilities can be detected early during development and deployment stages.</w:t>
+      </w:r>
+    </w:p>
+    <w:p>
+      <w:pPr>
+        <w:pStyle w:val="references"/>
+        <w:numPr>
+          <w:ilvl w:val="0"/>
+          <w:numId w:val="0"/>
+        </w:numPr>
+        <w:spacing w:line="12pt" w:lineRule="auto"/>
+        <w:ind w:start="18pt"/>
+        <w:rPr>
+          <w:bCs/>
+          <w:color w:val="000000" w:themeColor="text1"/>
+          <w:spacing w:val="-1"/>
+          <w:sz w:val="20"/>
+          <w:szCs w:val="20"/>
+          <w:lang w:val="en-IN" w:eastAsia="x-none"/>
+        </w:rPr>
+      </w:pPr>
+      <w:r>
+        <w:rPr>
+          <w:bCs/>
+          <w:color w:val="000000" w:themeColor="text1"/>
+          <w:spacing w:val="-1"/>
+          <w:sz w:val="20"/>
+          <w:szCs w:val="20"/>
+          <w:lang w:val="en-IN" w:eastAsia="x-none"/>
+        </w:rPr>
+        <w:t>The use of Docker and Kubernetes enables efficient containerized deployment, while Terraform automates infrastructure provisioning in the cloud environment. Monitoring tools such as Prometheus and Grafana provide continuous monitoring and visualization of system performance.</w:t>
+      </w:r>
+    </w:p>
+    <w:p>
+      <w:pPr>
+        <w:pStyle w:val="references"/>
+        <w:numPr>
+          <w:ilvl w:val="0"/>
+          <w:numId w:val="0"/>
+        </w:numPr>
+        <w:spacing w:line="12pt" w:lineRule="auto"/>
+        <w:ind w:start="18pt"/>
+        <w:rPr>
+          <w:bCs/>
+          <w:color w:val="000000" w:themeColor="text1"/>
+          <w:spacing w:val="-1"/>
+          <w:sz w:val="20"/>
+          <w:szCs w:val="20"/>
+          <w:lang w:val="en-IN" w:eastAsia="x-none"/>
+        </w:rPr>
+      </w:pPr>
+      <w:r>
+        <w:rPr>
+          <w:bCs/>
+          <w:color w:val="000000" w:themeColor="text1"/>
+          <w:spacing w:val="-1"/>
+          <w:sz w:val="20"/>
+          <w:szCs w:val="20"/>
+          <w:lang w:val="en-IN" w:eastAsia="x-none"/>
+        </w:rPr>
+        <w:t>The proposed Secure DevOps pipeline improves application security, reliability, and deployment efficiency by integrating security testing and monitoring into the CI/CD workflow. Future work may focus on integrating advanced security analytics and automated threat detection to further enhance system security.</w:t>
       </w:r>
     </w:p>
     <w:p>
@@ -2121,7 +2208,7 @@
         <w:jc w:val="center"/>
         <w:rPr>
           <w:rFonts w:eastAsia="SimSun"/>
-          <w:b/>
+          <w:bCs/>
           <w:noProof w:val="0"/>
           <w:color w:val="FFC000"/>
           <w:spacing w:val="-1"/>
@@ -2145,21 +2232,22 @@
           <w:rFonts w:eastAsia="SimSun"/>
           <w:b/>
           <w:noProof w:val="0"/>
-          <w:color w:val="00B0F0"/>
+          <w:color w:val="FFC000"/>
           <w:spacing w:val="-1"/>
           <w:sz w:val="20"/>
           <w:szCs w:val="20"/>
           <w:lang w:eastAsia="x-none"/>
         </w:rPr>
-        <w:sectPr>
-          <w:type w:val="continuous"/>
-          <w:pgSz w:w="595.30pt" w:h="841.90pt" w:code="9"/>
-          <w:pgMar w:top="54pt" w:right="45.35pt" w:bottom="72pt" w:left="45.35pt" w:header="36pt" w:footer="36pt" w:gutter="0pt"/>
-          <w:cols w:num="2" w:space="18pt"/>
-          <w:docGrid w:linePitch="360"/>
-        </w:sectPr>
-      </w:pPr>
-      <w:r>
+      </w:pPr>
+    </w:p>
+    <w:p>
+      <w:pPr>
+        <w:pStyle w:val="references"/>
+        <w:numPr>
+          <w:ilvl w:val="0"/>
+          <w:numId w:val="0"/>
+        </w:numPr>
+        <w:spacing w:line="12pt" w:lineRule="auto"/>
         <w:rPr>
           <w:rFonts w:eastAsia="SimSun"/>
           <w:b/>
@@ -2170,21 +2258,14 @@
           <w:szCs w:val="20"/>
           <w:lang w:eastAsia="x-none"/>
         </w:rPr>
-        <w:t>Make sure to remove all placeholder and explanatory text from the template when you add your own text</w:t>
-      </w:r>
-      <w:r>
-        <w:rPr>
-          <w:rFonts w:eastAsia="SimSun"/>
-          <w:b/>
-          <w:noProof w:val="0"/>
-          <w:color w:val="00B0F0"/>
-          <w:spacing w:val="-1"/>
-          <w:sz w:val="20"/>
-          <w:szCs w:val="20"/>
-          <w:lang w:eastAsia="x-none"/>
-        </w:rPr>
-        <w:t>. This text should not be here in the final version!</w:t>
-      </w:r>
+        <w:sectPr>
+          <w:type w:val="continuous"/>
+          <w:pgSz w:w="595.30pt" w:h="841.90pt" w:code="9"/>
+          <w:pgMar w:top="54pt" w:right="45.35pt" w:bottom="72pt" w:left="45.35pt" w:header="36pt" w:footer="36pt" w:gutter="0pt"/>
+          <w:cols w:num="2" w:space="18pt"/>
+          <w:docGrid w:linePitch="360"/>
+        </w:sectPr>
+      </w:pPr>
     </w:p>
     <w:p/>
     <w:sectPr>
@@ -4148,6 +4229,7 @@
     <w:name w:val="heading 5"/>
     <w:basedOn w:val="Normal"/>
     <w:next w:val="Normal"/>
+    <w:link w:val="Heading5Char"/>
     <w:qFormat/>
     <w:pPr>
       <w:tabs>
@@ -4500,6 +4582,16 @@
       <w:bCs/>
     </w:rPr>
   </w:style>
+  <w:style w:type="character" w:customStyle="1" w:styleId="Heading5Char">
+    <w:name w:val="Heading 5 Char"/>
+    <w:basedOn w:val="DefaultParagraphFont"/>
+    <w:link w:val="Heading5"/>
+    <w:rsid w:val="005F13C8"/>
+    <w:rPr>
+      <w:smallCaps/>
+      <w:noProof/>
+    </w:rPr>
+  </w:style>
 </w:styles>
 </file>
 

</xml_diff>

<commit_message>
modified the position conclusion in the survey paper
</commit_message>
<xml_diff>
--- a/Documentation/Survey Paper/Survey-paper.docx
+++ b/Documentation/Survey Paper/Survey-paper.docx
@@ -22,6 +22,275 @@
           <w:docGrid w:linePitch="360"/>
         </w:sectPr>
       </w:pPr>
+      <w:r>
+        <w:rPr>
+          <w:b/>
+          <w:bCs/>
+          <w:sz w:val="18"/>
+          <w:szCs w:val="18"/>
+        </w:rPr>
+        <w:drawing>
+          <wp:anchor distT="45720" distB="45720" distL="114300" distR="114300" simplePos="0" relativeHeight="251665920" behindDoc="0" locked="0" layoutInCell="1" allowOverlap="1" wp14:anchorId="7639E3C5" wp14:editId="4E30DEA2">
+            <wp:simplePos x="0" y="0"/>
+            <wp:positionH relativeFrom="column">
+              <wp:posOffset>3810</wp:posOffset>
+            </wp:positionH>
+            <wp:positionV relativeFrom="paragraph">
+              <wp:posOffset>1706880</wp:posOffset>
+            </wp:positionV>
+            <wp:extent cx="3274695" cy="777240"/>
+            <wp:effectExtent l="0" t="0" r="20955" b="15240"/>
+            <wp:wrapSquare wrapText="bothSides"/>
+            <wp:docPr id="46397045" name="Text Box 2"/>
+            <wp:cNvGraphicFramePr>
+              <a:graphicFrameLocks xmlns:a="http://purl.oclc.org/ooxml/drawingml/main"/>
+            </wp:cNvGraphicFramePr>
+            <a:graphic xmlns:a="http://purl.oclc.org/ooxml/drawingml/main">
+              <a:graphicData uri="http://schemas.microsoft.com/office/word/2010/wordprocessingShape">
+                <wp:wsp>
+                  <wp:cNvSpPr txBox="1">
+                    <a:spLocks noChangeArrowheads="1"/>
+                  </wp:cNvSpPr>
+                  <wp:spPr bwMode="auto">
+                    <a:xfrm>
+                      <a:off x="0" y="0"/>
+                      <a:ext cx="3274695" cy="777240"/>
+                    </a:xfrm>
+                    <a:prstGeom prst="rect">
+                      <a:avLst/>
+                    </a:prstGeom>
+                    <a:solidFill>
+                      <a:srgbClr val="FFFFFF"/>
+                    </a:solidFill>
+                    <a:ln w="9525">
+                      <a:solidFill>
+                        <a:srgbClr val="000000"/>
+                      </a:solidFill>
+                      <a:miter lim="800%"/>
+                      <a:headEnd/>
+                      <a:tailEnd/>
+                    </a:ln>
+                  </wp:spPr>
+                  <wp:txbx>
+                    <wne:txbxContent>
+                      <w:p>
+                        <w:r>
+                          <w:rPr>
+                            <w:b/>
+                            <w:bCs/>
+                            <w:sz w:val="18"/>
+                            <w:szCs w:val="18"/>
+                          </w:rPr>
+                          <w:t>Revanth Kumar T S</w:t>
+                        </w:r>
+                        <w:r>
+                          <w:rPr>
+                            <w:sz w:val="18"/>
+                            <w:szCs w:val="18"/>
+                          </w:rPr>
+                          <w:br/>
+                          <w:t xml:space="preserve">Department of Computer Science and </w:t>
+                        </w:r>
+                        <w:r>
+                          <w:rPr>
+                            <w:sz w:val="18"/>
+                            <w:szCs w:val="18"/>
+                          </w:rPr>
+                          <w:t xml:space="preserve">  </w:t>
+                        </w:r>
+                        <w:r>
+                          <w:rPr>
+                            <w:sz w:val="18"/>
+                            <w:szCs w:val="18"/>
+                          </w:rPr>
+                          <w:t>Engineering</w:t>
+                        </w:r>
+                        <w:r>
+                          <w:rPr>
+                            <w:sz w:val="18"/>
+                            <w:szCs w:val="18"/>
+                          </w:rPr>
+                          <w:t xml:space="preserve">                              </w:t>
+                        </w:r>
+                        <w:r>
+                          <w:rPr>
+                            <w:sz w:val="18"/>
+                            <w:szCs w:val="18"/>
+                          </w:rPr>
+                          <w:br/>
+                          <w:t>Global Academy of Technology</w:t>
+                        </w:r>
+                        <w:r>
+                          <w:rPr>
+                            <w:sz w:val="18"/>
+                            <w:szCs w:val="18"/>
+                          </w:rPr>
+                          <w:br/>
+                          <w:t>Bengaluru, India</w:t>
+                        </w:r>
+                        <w:r>
+                          <w:rPr>
+                            <w:sz w:val="18"/>
+                            <w:szCs w:val="18"/>
+                          </w:rPr>
+                          <w:br/>
+                        </w:r>
+                        <w:r>
+                          <w:t>revanthkumarts123@gmail.com</w:t>
+                        </w:r>
+                      </w:p>
+                      <w:p/>
+                    </wne:txbxContent>
+                  </wp:txbx>
+                  <wp:bodyPr rot="0" vert="horz" wrap="square" lIns="91440" tIns="45720" rIns="91440" bIns="45720" anchor="t" anchorCtr="0">
+                    <a:noAutofit/>
+                  </wp:bodyPr>
+                </wp:wsp>
+              </a:graphicData>
+            </a:graphic>
+            <wp14:sizeRelH relativeFrom="margin">
+              <wp14:pctWidth>0%</wp14:pctWidth>
+            </wp14:sizeRelH>
+            <wp14:sizeRelV relativeFrom="margin">
+              <wp14:pctHeight>0%</wp14:pctHeight>
+            </wp14:sizeRelV>
+          </wp:anchor>
+        </w:drawing>
+      </w:r>
+      <w:r>
+        <w:rPr>
+          <w:b/>
+          <w:bCs/>
+          <w:sz w:val="18"/>
+          <w:szCs w:val="18"/>
+        </w:rPr>
+        <w:drawing>
+          <wp:anchor distT="45720" distB="45720" distL="114300" distR="114300" simplePos="0" relativeHeight="251663872" behindDoc="0" locked="0" layoutInCell="1" allowOverlap="1" wp14:anchorId="0D7691DA" wp14:editId="4FE03D5E">
+            <wp:simplePos x="0" y="0"/>
+            <wp:positionH relativeFrom="column">
+              <wp:posOffset>3342005</wp:posOffset>
+            </wp:positionH>
+            <wp:positionV relativeFrom="paragraph">
+              <wp:posOffset>1699260</wp:posOffset>
+            </wp:positionV>
+            <wp:extent cx="3261360" cy="1404620"/>
+            <wp:effectExtent l="0" t="0" r="15240" b="27940"/>
+            <wp:wrapSquare wrapText="bothSides"/>
+            <wp:docPr id="953592618" name="Text Box 2"/>
+            <wp:cNvGraphicFramePr>
+              <a:graphicFrameLocks xmlns:a="http://purl.oclc.org/ooxml/drawingml/main"/>
+            </wp:cNvGraphicFramePr>
+            <a:graphic xmlns:a="http://purl.oclc.org/ooxml/drawingml/main">
+              <a:graphicData uri="http://schemas.microsoft.com/office/word/2010/wordprocessingShape">
+                <wp:wsp>
+                  <wp:cNvSpPr txBox="1">
+                    <a:spLocks noChangeArrowheads="1"/>
+                  </wp:cNvSpPr>
+                  <wp:spPr bwMode="auto">
+                    <a:xfrm>
+                      <a:off x="0" y="0"/>
+                      <a:ext cx="3261360" cy="1404620"/>
+                    </a:xfrm>
+                    <a:prstGeom prst="rect">
+                      <a:avLst/>
+                    </a:prstGeom>
+                    <a:solidFill>
+                      <a:srgbClr val="FFFFFF"/>
+                    </a:solidFill>
+                    <a:ln w="9525">
+                      <a:solidFill>
+                        <a:srgbClr val="000000"/>
+                      </a:solidFill>
+                      <a:miter lim="800%"/>
+                      <a:headEnd/>
+                      <a:tailEnd/>
+                    </a:ln>
+                  </wp:spPr>
+                  <wp:txbx>
+                    <wne:txbxContent>
+                      <w:p>
+                        <w:r>
+                          <w:rPr>
+                            <w:b/>
+                            <w:bCs/>
+                            <w:sz w:val="18"/>
+                            <w:szCs w:val="18"/>
+                          </w:rPr>
+                          <w:t xml:space="preserve">Vignesh P                                                           </w:t>
+                        </w:r>
+                        <w:r>
+                          <w:rPr>
+                            <w:sz w:val="18"/>
+                            <w:szCs w:val="18"/>
+                          </w:rPr>
+                          <w:br/>
+                          <w:t xml:space="preserve">Department of Computer Science and </w:t>
+                        </w:r>
+                        <w:r>
+                          <w:rPr>
+                            <w:sz w:val="18"/>
+                            <w:szCs w:val="18"/>
+                          </w:rPr>
+                          <w:t xml:space="preserve">  </w:t>
+                        </w:r>
+                        <w:r>
+                          <w:rPr>
+                            <w:sz w:val="18"/>
+                            <w:szCs w:val="18"/>
+                          </w:rPr>
+                          <w:t>Engineering</w:t>
+                        </w:r>
+                        <w:r>
+                          <w:rPr>
+                            <w:sz w:val="18"/>
+                            <w:szCs w:val="18"/>
+                          </w:rPr>
+                          <w:t xml:space="preserve">                              </w:t>
+                        </w:r>
+                        <w:r>
+                          <w:rPr>
+                            <w:sz w:val="18"/>
+                            <w:szCs w:val="18"/>
+                          </w:rPr>
+                          <w:br/>
+                          <w:t>Global Academy of Technology</w:t>
+                        </w:r>
+                        <w:r>
+                          <w:rPr>
+                            <w:sz w:val="18"/>
+                            <w:szCs w:val="18"/>
+                          </w:rPr>
+                          <w:br/>
+                          <w:t>Bengaluru, India</w:t>
+                        </w:r>
+                        <w:r>
+                          <w:rPr>
+                            <w:sz w:val="18"/>
+                            <w:szCs w:val="18"/>
+                          </w:rPr>
+                          <w:br/>
+                        </w:r>
+                        <w:r>
+                          <w:t>palanivignesh31@gmail.com</w:t>
+                        </w:r>
+                      </w:p>
+                    </wne:txbxContent>
+                  </wp:txbx>
+                  <wp:bodyPr rot="0" vert="horz" wrap="square" lIns="91440" tIns="45720" rIns="91440" bIns="45720" anchor="t" anchorCtr="0">
+                    <a:spAutoFit/>
+                  </wp:bodyPr>
+                </wp:wsp>
+              </a:graphicData>
+            </a:graphic>
+            <wp14:sizeRelH relativeFrom="margin">
+              <wp14:pctWidth>0%</wp14:pctWidth>
+            </wp14:sizeRelH>
+            <wp14:sizeRelV relativeFrom="margin">
+              <wp14:pctHeight>20%</wp14:pctHeight>
+            </wp14:sizeRelV>
+          </wp:anchor>
+        </w:drawing>
+      </w:r>
       <w:r>
         <w:rPr>
           <w:b/>
@@ -169,7 +438,7 @@
           <w:szCs w:val="18"/>
         </w:rPr>
         <w:drawing>
-          <wp:anchor distT="45720" distB="45720" distL="114300" distR="114300" simplePos="0" relativeHeight="251659776" behindDoc="0" locked="0" layoutInCell="1" allowOverlap="1" wp14:anchorId="23649975" wp14:editId="3308DA6B">
+          <wp:anchor distT="45720" distB="45720" distL="114300" distR="114300" simplePos="0" relativeHeight="251659776" behindDoc="0" locked="0" layoutInCell="1" allowOverlap="1" wp14:anchorId="23649975" wp14:editId="6C6BE891">
             <wp:simplePos x="0" y="0"/>
             <wp:positionH relativeFrom="margin">
               <wp:align>left</wp:align>
@@ -285,275 +554,6 @@
                           <w:t>shakthivelk1124@gmail.com</w:t>
                         </w:r>
                       </w:p>
-                    </wne:txbxContent>
-                  </wp:txbx>
-                  <wp:bodyPr rot="0" vert="horz" wrap="square" lIns="91440" tIns="45720" rIns="91440" bIns="45720" anchor="t" anchorCtr="0">
-                    <a:noAutofit/>
-                  </wp:bodyPr>
-                </wp:wsp>
-              </a:graphicData>
-            </a:graphic>
-            <wp14:sizeRelH relativeFrom="margin">
-              <wp14:pctWidth>0%</wp14:pctWidth>
-            </wp14:sizeRelH>
-            <wp14:sizeRelV relativeFrom="margin">
-              <wp14:pctHeight>0%</wp14:pctHeight>
-            </wp14:sizeRelV>
-          </wp:anchor>
-        </w:drawing>
-      </w:r>
-      <w:r>
-        <w:rPr>
-          <w:b/>
-          <w:bCs/>
-          <w:sz w:val="18"/>
-          <w:szCs w:val="18"/>
-        </w:rPr>
-        <w:drawing>
-          <wp:anchor distT="45720" distB="45720" distL="114300" distR="114300" simplePos="0" relativeHeight="251663872" behindDoc="0" locked="0" layoutInCell="1" allowOverlap="1" wp14:anchorId="0D7691DA" wp14:editId="63EFBAA0">
-            <wp:simplePos x="0" y="0"/>
-            <wp:positionH relativeFrom="column">
-              <wp:posOffset>3322133</wp:posOffset>
-            </wp:positionH>
-            <wp:positionV relativeFrom="paragraph">
-              <wp:posOffset>1699708</wp:posOffset>
-            </wp:positionV>
-            <wp:extent cx="3509010" cy="1404620"/>
-            <wp:effectExtent l="0" t="0" r="15240" b="23495"/>
-            <wp:wrapSquare wrapText="bothSides"/>
-            <wp:docPr id="953592618" name="Text Box 2"/>
-            <wp:cNvGraphicFramePr>
-              <a:graphicFrameLocks xmlns:a="http://purl.oclc.org/ooxml/drawingml/main"/>
-            </wp:cNvGraphicFramePr>
-            <a:graphic xmlns:a="http://purl.oclc.org/ooxml/drawingml/main">
-              <a:graphicData uri="http://schemas.microsoft.com/office/word/2010/wordprocessingShape">
-                <wp:wsp>
-                  <wp:cNvSpPr txBox="1">
-                    <a:spLocks noChangeArrowheads="1"/>
-                  </wp:cNvSpPr>
-                  <wp:spPr bwMode="auto">
-                    <a:xfrm>
-                      <a:off x="0" y="0"/>
-                      <a:ext cx="3509010" cy="1404620"/>
-                    </a:xfrm>
-                    <a:prstGeom prst="rect">
-                      <a:avLst/>
-                    </a:prstGeom>
-                    <a:solidFill>
-                      <a:srgbClr val="FFFFFF"/>
-                    </a:solidFill>
-                    <a:ln w="9525">
-                      <a:solidFill>
-                        <a:srgbClr val="000000"/>
-                      </a:solidFill>
-                      <a:miter lim="800%"/>
-                      <a:headEnd/>
-                      <a:tailEnd/>
-                    </a:ln>
-                  </wp:spPr>
-                  <wp:txbx>
-                    <wne:txbxContent>
-                      <w:p>
-                        <w:r>
-                          <w:rPr>
-                            <w:b/>
-                            <w:bCs/>
-                            <w:sz w:val="18"/>
-                            <w:szCs w:val="18"/>
-                          </w:rPr>
-                          <w:t xml:space="preserve">Vignesh P                                                           </w:t>
-                        </w:r>
-                        <w:r>
-                          <w:rPr>
-                            <w:sz w:val="18"/>
-                            <w:szCs w:val="18"/>
-                          </w:rPr>
-                          <w:br/>
-                          <w:t xml:space="preserve">Department of Computer Science and </w:t>
-                        </w:r>
-                        <w:r>
-                          <w:rPr>
-                            <w:sz w:val="18"/>
-                            <w:szCs w:val="18"/>
-                          </w:rPr>
-                          <w:t xml:space="preserve">  </w:t>
-                        </w:r>
-                        <w:r>
-                          <w:rPr>
-                            <w:sz w:val="18"/>
-                            <w:szCs w:val="18"/>
-                          </w:rPr>
-                          <w:t>Engineering</w:t>
-                        </w:r>
-                        <w:r>
-                          <w:rPr>
-                            <w:sz w:val="18"/>
-                            <w:szCs w:val="18"/>
-                          </w:rPr>
-                          <w:t xml:space="preserve">                              </w:t>
-                        </w:r>
-                        <w:r>
-                          <w:rPr>
-                            <w:sz w:val="18"/>
-                            <w:szCs w:val="18"/>
-                          </w:rPr>
-                          <w:br/>
-                          <w:t>Global Academy of Technology</w:t>
-                        </w:r>
-                        <w:r>
-                          <w:rPr>
-                            <w:sz w:val="18"/>
-                            <w:szCs w:val="18"/>
-                          </w:rPr>
-                          <w:br/>
-                          <w:t>Bengaluru, India</w:t>
-                        </w:r>
-                        <w:r>
-                          <w:rPr>
-                            <w:sz w:val="18"/>
-                            <w:szCs w:val="18"/>
-                          </w:rPr>
-                          <w:br/>
-                        </w:r>
-                        <w:r>
-                          <w:t>palanivignesh31@gmail.com</w:t>
-                        </w:r>
-                      </w:p>
-                    </wne:txbxContent>
-                  </wp:txbx>
-                  <wp:bodyPr rot="0" vert="horz" wrap="square" lIns="91440" tIns="45720" rIns="91440" bIns="45720" anchor="t" anchorCtr="0">
-                    <a:spAutoFit/>
-                  </wp:bodyPr>
-                </wp:wsp>
-              </a:graphicData>
-            </a:graphic>
-            <wp14:sizeRelH relativeFrom="margin">
-              <wp14:pctWidth>0%</wp14:pctWidth>
-            </wp14:sizeRelH>
-            <wp14:sizeRelV relativeFrom="margin">
-              <wp14:pctHeight>20%</wp14:pctHeight>
-            </wp14:sizeRelV>
-          </wp:anchor>
-        </w:drawing>
-      </w:r>
-      <w:r>
-        <w:rPr>
-          <w:b/>
-          <w:bCs/>
-          <w:sz w:val="18"/>
-          <w:szCs w:val="18"/>
-        </w:rPr>
-        <w:drawing>
-          <wp:anchor distT="45720" distB="45720" distL="114300" distR="114300" simplePos="0" relativeHeight="251665920" behindDoc="0" locked="0" layoutInCell="1" allowOverlap="1" wp14:anchorId="7639E3C5" wp14:editId="08D87E87">
-            <wp:simplePos x="0" y="0"/>
-            <wp:positionH relativeFrom="column">
-              <wp:posOffset>3322</wp:posOffset>
-            </wp:positionH>
-            <wp:positionV relativeFrom="paragraph">
-              <wp:posOffset>1710690</wp:posOffset>
-            </wp:positionV>
-            <wp:extent cx="3213100" cy="760730"/>
-            <wp:effectExtent l="0" t="0" r="25400" b="20320"/>
-            <wp:wrapSquare wrapText="bothSides"/>
-            <wp:docPr id="46397045" name="Text Box 2"/>
-            <wp:cNvGraphicFramePr>
-              <a:graphicFrameLocks xmlns:a="http://purl.oclc.org/ooxml/drawingml/main"/>
-            </wp:cNvGraphicFramePr>
-            <a:graphic xmlns:a="http://purl.oclc.org/ooxml/drawingml/main">
-              <a:graphicData uri="http://schemas.microsoft.com/office/word/2010/wordprocessingShape">
-                <wp:wsp>
-                  <wp:cNvSpPr txBox="1">
-                    <a:spLocks noChangeArrowheads="1"/>
-                  </wp:cNvSpPr>
-                  <wp:spPr bwMode="auto">
-                    <a:xfrm>
-                      <a:off x="0" y="0"/>
-                      <a:ext cx="3213100" cy="760730"/>
-                    </a:xfrm>
-                    <a:prstGeom prst="rect">
-                      <a:avLst/>
-                    </a:prstGeom>
-                    <a:solidFill>
-                      <a:srgbClr val="FFFFFF"/>
-                    </a:solidFill>
-                    <a:ln w="9525">
-                      <a:solidFill>
-                        <a:srgbClr val="000000"/>
-                      </a:solidFill>
-                      <a:miter lim="800%"/>
-                      <a:headEnd/>
-                      <a:tailEnd/>
-                    </a:ln>
-                  </wp:spPr>
-                  <wp:txbx>
-                    <wne:txbxContent>
-                      <w:p>
-                        <w:r>
-                          <w:rPr>
-                            <w:b/>
-                            <w:bCs/>
-                            <w:sz w:val="18"/>
-                            <w:szCs w:val="18"/>
-                          </w:rPr>
-                          <w:t>Revanth Kumar T S</w:t>
-                        </w:r>
-                        <w:r>
-                          <w:rPr>
-                            <w:sz w:val="18"/>
-                            <w:szCs w:val="18"/>
-                          </w:rPr>
-                          <w:br/>
-                          <w:t xml:space="preserve">Department of Computer Science and </w:t>
-                        </w:r>
-                        <w:r>
-                          <w:rPr>
-                            <w:sz w:val="18"/>
-                            <w:szCs w:val="18"/>
-                          </w:rPr>
-                          <w:t xml:space="preserve">  </w:t>
-                        </w:r>
-                        <w:r>
-                          <w:rPr>
-                            <w:sz w:val="18"/>
-                            <w:szCs w:val="18"/>
-                          </w:rPr>
-                          <w:t>Engineering</w:t>
-                        </w:r>
-                        <w:r>
-                          <w:rPr>
-                            <w:sz w:val="18"/>
-                            <w:szCs w:val="18"/>
-                          </w:rPr>
-                          <w:t xml:space="preserve">                              </w:t>
-                        </w:r>
-                        <w:r>
-                          <w:rPr>
-                            <w:sz w:val="18"/>
-                            <w:szCs w:val="18"/>
-                          </w:rPr>
-                          <w:br/>
-                          <w:t>Global Academy of Technology</w:t>
-                        </w:r>
-                        <w:r>
-                          <w:rPr>
-                            <w:sz w:val="18"/>
-                            <w:szCs w:val="18"/>
-                          </w:rPr>
-                          <w:br/>
-                          <w:t>Bengaluru, India</w:t>
-                        </w:r>
-                        <w:r>
-                          <w:rPr>
-                            <w:sz w:val="18"/>
-                            <w:szCs w:val="18"/>
-                          </w:rPr>
-                          <w:br/>
-                        </w:r>
-                        <w:r>
-                          <w:t>revanthkumarts123@gmail.com</w:t>
-                        </w:r>
-                      </w:p>
-                      <w:p/>
                     </wne:txbxContent>
                   </wp:txbx>
                   <wp:bodyPr rot="0" vert="horz" wrap="square" lIns="91440" tIns="45720" rIns="91440" bIns="45720" anchor="t" anchorCtr="0">
@@ -1834,256 +1834,6 @@
     <w:p>
       <w:pPr>
         <w:pStyle w:val="Heading5"/>
-        <w:jc w:val="both"/>
-      </w:pPr>
-      <w:r>
-        <w:t xml:space="preserve">                                      </w:t>
-      </w:r>
-      <w:r>
-        <w:t xml:space="preserve"> </w:t>
-      </w:r>
-      <w:r>
-        <w:t>Acknowledgment</w:t>
-      </w:r>
-      <w:r>
-        <w:t>s</w:t>
-      </w:r>
-    </w:p>
-    <w:p>
-      <w:pPr>
-        <w:pStyle w:val="BodyText"/>
-        <w:rPr>
-          <w:lang w:val="en-US"/>
-        </w:rPr>
-      </w:pPr>
-      <w:r>
-        <w:rPr>
-          <w:lang w:val="en-US"/>
-        </w:rPr>
-        <w:t xml:space="preserve">The authors would like to express their sincere gratitude to the Department of Computer Science and Engineering at Global Academy of Technology, Bengaluru, India, for providing the necessary support and facilities to carry out this research work. The authors are especially thankful to </w:t>
-      </w:r>
-      <w:r>
-        <w:rPr>
-          <w:b/>
-          <w:bCs/>
-          <w:lang w:val="en-US"/>
-        </w:rPr>
-        <w:t>Prof. Sameena H. S., Assistant Professor</w:t>
-      </w:r>
-      <w:r>
-        <w:rPr>
-          <w:lang w:val="en-US"/>
-        </w:rPr>
-        <w:t xml:space="preserve">, for her continuous guidance, valuable suggestions, and encouragement throughout the development of this project. Her support and </w:t>
-      </w:r>
-      <w:r>
-        <w:rPr>
-          <w:lang w:val="en-US"/>
-        </w:rPr>
-        <w:t>insights have greatly contributed to the successful completion of this work.</w:t>
-      </w:r>
-    </w:p>
-    <w:p>
-      <w:pPr>
-        <w:pStyle w:val="Heading5"/>
-      </w:pPr>
-      <w:r>
-        <w:t>References</w:t>
-      </w:r>
-    </w:p>
-    <w:p>
-      <w:pPr>
-        <w:pStyle w:val="references"/>
-        <w:ind w:start="17.70pt" w:hanging="17.70pt"/>
-      </w:pPr>
-      <w:r>
-        <w:t xml:space="preserve">M. Marandi, A. Bertia, and S. Silas, “Implementing and Automating Security Scanning to a DevSecOps CI/CD Pipeline,” in </w:t>
-      </w:r>
-      <w:r>
-        <w:rPr>
-          <w:i/>
-          <w:iCs/>
-        </w:rPr>
-        <w:t>Proc. 2023 World Conf. Communication &amp; Computing (WCONF)</w:t>
-      </w:r>
-      <w:r>
-        <w:t>, Raipur, India, Jul. 2023, doi: 10.1109/WCONF58270.2023.10235015.</w:t>
-      </w:r>
-    </w:p>
-    <w:p>
-      <w:pPr>
-        <w:pStyle w:val="references"/>
-        <w:ind w:start="17.70pt" w:hanging="17.70pt"/>
-      </w:pPr>
-      <w:r>
-        <w:t xml:space="preserve">M. Voggenreiter, F. Angermeir, F. Moyón, U. Schöpp, and P. Bonvin, “Automated Security Findings Management: A Case Study in Industrial DevOps,” in </w:t>
-      </w:r>
-      <w:r>
-        <w:rPr>
-          <w:i/>
-          <w:iCs/>
-        </w:rPr>
-        <w:t>Proc. 46th Int. Conf. Software Engineering: Software Engineering in Practice (ICSE-SEIP)</w:t>
-      </w:r>
-      <w:r>
-        <w:t>, Apr. 2024, doi: 10.1145/3639477.3639744.</w:t>
-      </w:r>
-    </w:p>
-    <w:p>
-      <w:pPr>
-        <w:pStyle w:val="references"/>
-        <w:ind w:start="17.70pt" w:hanging="17.70pt"/>
-      </w:pPr>
-      <w:r>
-        <w:t xml:space="preserve">A. Nayanajith and R. Wickramarachchi, “Challenges Affecting the Successful Adoption of DevOps Practices: A Systematic Literature Review,” in </w:t>
-      </w:r>
-      <w:r>
-        <w:rPr>
-          <w:i/>
-          <w:iCs/>
-        </w:rPr>
-        <w:t>Proc. 4th Int. Conf. Advanced Research in Computing (ICARC)</w:t>
-      </w:r>
-      <w:r>
-        <w:t>, 2024, doi: 10.1109/ICARC61713.2024.10499735.</w:t>
-      </w:r>
-    </w:p>
-    <w:p>
-      <w:pPr>
-        <w:pStyle w:val="references"/>
-        <w:ind w:start="17.70pt" w:hanging="17.70pt"/>
-      </w:pPr>
-      <w:r>
-        <w:t xml:space="preserve">N. Dinh, V. T. Hoang, B. N. Van, T. H. Huong, H. D. T. Hong, H. N. Trung, and K. T. Trung, “Enhancing Smart Contract Security Through DevSecOps: An Adaptive Approach for Vulnerability Detection,” </w:t>
-      </w:r>
-      <w:r>
-        <w:rPr>
-          <w:i/>
-          <w:iCs/>
-        </w:rPr>
-        <w:t>IEEE Access</w:t>
-      </w:r>
-      <w:r>
-        <w:t>, vol. 13, pp. 159454–159520, 2025, doi: 10.1109/ACCESS.2025.3606572.</w:t>
-      </w:r>
-    </w:p>
-    <w:p>
-      <w:pPr>
-        <w:pStyle w:val="references"/>
-        <w:ind w:start="17.70pt" w:hanging="17.70pt"/>
-      </w:pPr>
-      <w:r>
-        <w:t xml:space="preserve">R. Ashtagi, Y. Bhalerao, C. Belani, P. Bhalerao, and A. Chawle, “Building Resilient CI/CD Pipelines: A DevOps Security-First Framework,” in </w:t>
-      </w:r>
-      <w:r>
-        <w:rPr>
-          <w:i/>
-          <w:iCs/>
-        </w:rPr>
-        <w:t>Proc. 2025 Int. Conf. Computational, Communication and Information Technology (ICCCIT)</w:t>
-      </w:r>
-      <w:r>
-        <w:t>, 2025, doi: 10.1109/ICCCIT62592.2025.10927871.</w:t>
-      </w:r>
-    </w:p>
-    <w:p>
-      <w:pPr>
-        <w:pStyle w:val="references"/>
-        <w:ind w:start="17.70pt" w:hanging="17.70pt"/>
-      </w:pPr>
-      <w:r>
-        <w:t xml:space="preserve">R. C. B. Ramos and S. G. Yoo, “Cybersecurity in DevOps Environments: A Systematic Literature Review,” </w:t>
-      </w:r>
-      <w:r>
-        <w:rPr>
-          <w:i/>
-          <w:iCs/>
-        </w:rPr>
-        <w:t>IEEE Access</w:t>
-      </w:r>
-      <w:r>
-        <w:t>, vol. 13, pp. 191959–191980, 2025, doi: 10.1109/ACCESS.2025.3582892.</w:t>
-      </w:r>
-    </w:p>
-    <w:p>
-      <w:pPr>
-        <w:pStyle w:val="references"/>
-        <w:ind w:start="17.70pt" w:hanging="17.70pt"/>
-      </w:pPr>
-      <w:r>
-        <w:t xml:space="preserve">S. A. Ruk, Y. Mahmood, A. Azmi, N. F. M. Azmi, and S. Gul, “Effort Estimation in Agile and DevOps: A Systematic Literature Review of Stakeholder Dissatisfaction,” </w:t>
-      </w:r>
-      <w:r>
-        <w:rPr>
-          <w:i/>
-          <w:iCs/>
-        </w:rPr>
-        <w:t>IEEE Access</w:t>
-      </w:r>
-      <w:r>
-        <w:t>, vol. 13, pp. 167925–167960, 2025, doi: 10.1109/ACCESS.2025.3600321.</w:t>
-      </w:r>
-    </w:p>
-    <w:p>
-      <w:pPr>
-        <w:pStyle w:val="references"/>
-        <w:ind w:start="17.70pt" w:hanging="17.70pt"/>
-      </w:pPr>
-      <w:r>
-        <w:t xml:space="preserve">N. S, P. Manja, P. Mathur, and P. B. Honnavalli, “Extensive Review of Threat Models for DevSecOps,” </w:t>
-      </w:r>
-      <w:r>
-        <w:rPr>
-          <w:i/>
-          <w:iCs/>
-        </w:rPr>
-        <w:t>IEEE Access</w:t>
-      </w:r>
-      <w:r>
-        <w:t>, vol. 13, pp. 45252–45274, 2025, doi: 10.1109/ACCESS.2025.3547932.</w:t>
-      </w:r>
-    </w:p>
-    <w:p>
-      <w:pPr>
-        <w:pStyle w:val="references"/>
-        <w:ind w:start="17.70pt" w:hanging="17.70pt"/>
-      </w:pPr>
-      <w:r>
-        <w:t xml:space="preserve">M. A. Akbar and A. A. Alsanad, “Empirical Investigation of Key Enablers for Secure DevOps Practices,” </w:t>
-      </w:r>
-      <w:r>
-        <w:rPr>
-          <w:i/>
-          <w:iCs/>
-        </w:rPr>
-        <w:t>IEEE Access</w:t>
-      </w:r>
-      <w:r>
-        <w:t>, vol. 13, pp. 43698–43710, 2025, doi: 10.1109/ACCESS.2025.3549183.</w:t>
-      </w:r>
-    </w:p>
-    <w:p>
-      <w:pPr>
-        <w:pStyle w:val="references"/>
-        <w:ind w:start="17.70pt" w:hanging="17.70pt"/>
-      </w:pPr>
-      <w:r>
-        <w:t xml:space="preserve">J. Ababneh, E. Y. A. Al-Nsour, A. Al-Shaikh, M. R. Al-Mousa, A. Al-Zabin, M. Asassfeh, and H. Abualese, “Enhancing DevOps Continuous Monitoring Phase: Hybrid Intrusion Detection and Ensemble Learning System (HIDELS),” </w:t>
-      </w:r>
-      <w:r>
-        <w:rPr>
-          <w:i/>
-          <w:iCs/>
-        </w:rPr>
-        <w:t>IEEE Access</w:t>
-      </w:r>
-      <w:r>
-        <w:t>, vol. 14, pp. 4733–4755, 2026, doi: 10.1109/ACCESS.2026.3650793.</w:t>
-      </w:r>
-    </w:p>
-    <w:p>
-      <w:pPr>
-        <w:pStyle w:val="Heading5"/>
         <w:spacing w:before="12pt"/>
         <w:rPr>
           <w:b/>
@@ -2114,7 +1864,6 @@
           <w:numId w:val="0"/>
         </w:numPr>
         <w:spacing w:line="12pt" w:lineRule="auto"/>
-        <w:ind w:start="18pt"/>
         <w:rPr>
           <w:bCs/>
           <w:color w:val="000000" w:themeColor="text1"/>
@@ -2133,7 +1882,29 @@
           <w:szCs w:val="20"/>
           <w:lang w:val="en-IN" w:eastAsia="x-none"/>
         </w:rPr>
-        <w:t>This paper presented the implementation of a Secure DevOps (DevSecOps) CI/CD pipeline that integrates security practices into the software development lifecycle. By incorporating automated security tools such as SonarQube, OWASP ZAP, and Trivy, vulnerabilities can be detected early during development and deployment stages.</w:t>
+        <w:t>This paper presented the implementation of a Secure</w:t>
+      </w:r>
+      <w:r>
+        <w:rPr>
+          <w:bCs/>
+          <w:color w:val="000000" w:themeColor="text1"/>
+          <w:spacing w:val="-1"/>
+          <w:sz w:val="20"/>
+          <w:szCs w:val="20"/>
+          <w:lang w:val="en-IN" w:eastAsia="x-none"/>
+        </w:rPr>
+        <w:t xml:space="preserve"> </w:t>
+      </w:r>
+      <w:r>
+        <w:rPr>
+          <w:bCs/>
+          <w:color w:val="000000" w:themeColor="text1"/>
+          <w:spacing w:val="-1"/>
+          <w:sz w:val="20"/>
+          <w:szCs w:val="20"/>
+          <w:lang w:val="en-IN" w:eastAsia="x-none"/>
+        </w:rPr>
+        <w:t>DevOps (DevSecOps) CI/CD pipeline that integrates security practices into the software development lifecycle. By incorporating automated security tools such as SonarQube, OWASP ZAP, and Trivy, vulnerabilities can be detected early during development and deployment stages.</w:t>
       </w:r>
     </w:p>
     <w:p>
@@ -2144,7 +1915,6 @@
           <w:numId w:val="0"/>
         </w:numPr>
         <w:spacing w:line="12pt" w:lineRule="auto"/>
-        <w:ind w:start="18pt"/>
         <w:rPr>
           <w:bCs/>
           <w:color w:val="000000" w:themeColor="text1"/>
@@ -2174,7 +1944,6 @@
           <w:numId w:val="0"/>
         </w:numPr>
         <w:spacing w:line="12pt" w:lineRule="auto"/>
-        <w:ind w:start="18pt"/>
         <w:rPr>
           <w:bCs/>
           <w:color w:val="000000" w:themeColor="text1"/>
@@ -2194,6 +1963,250 @@
           <w:lang w:val="en-IN" w:eastAsia="x-none"/>
         </w:rPr>
         <w:t>The proposed Secure DevOps pipeline improves application security, reliability, and deployment efficiency by integrating security testing and monitoring into the CI/CD workflow. Future work may focus on integrating advanced security analytics and automated threat detection to further enhance system security.</w:t>
+      </w:r>
+    </w:p>
+    <w:p>
+      <w:pPr>
+        <w:pStyle w:val="Heading5"/>
+        <w:jc w:val="both"/>
+      </w:pPr>
+      <w:r>
+        <w:t xml:space="preserve">                                      </w:t>
+      </w:r>
+      <w:r>
+        <w:t xml:space="preserve"> </w:t>
+      </w:r>
+      <w:r>
+        <w:t>Acknowledgment</w:t>
+      </w:r>
+      <w:r>
+        <w:t>s</w:t>
+      </w:r>
+    </w:p>
+    <w:p>
+      <w:pPr>
+        <w:pStyle w:val="BodyText"/>
+        <w:rPr>
+          <w:lang w:val="en-US"/>
+        </w:rPr>
+      </w:pPr>
+      <w:r>
+        <w:rPr>
+          <w:lang w:val="en-US"/>
+        </w:rPr>
+        <w:t xml:space="preserve">The authors would like to express their sincere gratitude to the Department of Computer Science and Engineering at Global Academy of Technology, Bengaluru, India, for providing the necessary support and facilities to carry out this research work. The authors are especially thankful to </w:t>
+      </w:r>
+      <w:r>
+        <w:rPr>
+          <w:b/>
+          <w:bCs/>
+          <w:lang w:val="en-US"/>
+        </w:rPr>
+        <w:t>Prof. Sameena H. S., Assistant Professor</w:t>
+      </w:r>
+      <w:r>
+        <w:rPr>
+          <w:lang w:val="en-US"/>
+        </w:rPr>
+        <w:t>, for her continuous guidance, valuable suggestions, and encouragement throughout the development of this project. Her support and insights have greatly contributed to the successful completion of this work.</w:t>
+      </w:r>
+    </w:p>
+    <w:p>
+      <w:pPr>
+        <w:pStyle w:val="Heading5"/>
+      </w:pPr>
+      <w:r>
+        <w:t>References</w:t>
+      </w:r>
+    </w:p>
+    <w:p>
+      <w:pPr>
+        <w:pStyle w:val="references"/>
+        <w:ind w:start="17.70pt" w:hanging="17.70pt"/>
+      </w:pPr>
+      <w:r>
+        <w:t xml:space="preserve">M. Marandi, A. Bertia, and S. Silas, “Implementing and Automating Security Scanning to a DevSecOps CI/CD Pipeline,” in </w:t>
+      </w:r>
+      <w:r>
+        <w:rPr>
+          <w:i/>
+          <w:iCs/>
+        </w:rPr>
+        <w:t>Proc. 2023 World Conf. Communication &amp; Computing (WCONF)</w:t>
+      </w:r>
+      <w:r>
+        <w:t>, Raipur, India, Jul. 2023, doi: 10.1109/WCONF58270.2023.10235015.</w:t>
+      </w:r>
+    </w:p>
+    <w:p>
+      <w:pPr>
+        <w:pStyle w:val="references"/>
+        <w:ind w:start="17.70pt" w:hanging="17.70pt"/>
+      </w:pPr>
+      <w:r>
+        <w:t xml:space="preserve">M. Voggenreiter, F. Angermeir, F. Moyón, U. Schöpp, and P. Bonvin, “Automated Security Findings Management: A Case Study in Industrial DevOps,” in </w:t>
+      </w:r>
+      <w:r>
+        <w:rPr>
+          <w:i/>
+          <w:iCs/>
+        </w:rPr>
+        <w:t>Proc. 46th Int. Conf. Software Engineering: Software Engineering in Practice (ICSE-SEIP)</w:t>
+      </w:r>
+      <w:r>
+        <w:t>, Apr. 2024, doi: 10.1145/3639477.3639744.</w:t>
+      </w:r>
+    </w:p>
+    <w:p>
+      <w:pPr>
+        <w:pStyle w:val="references"/>
+        <w:ind w:start="17.70pt" w:hanging="17.70pt"/>
+      </w:pPr>
+      <w:r>
+        <w:t xml:space="preserve">A. Nayanajith and R. Wickramarachchi, “Challenges Affecting the Successful Adoption of DevOps Practices: A Systematic Literature Review,” in </w:t>
+      </w:r>
+      <w:r>
+        <w:rPr>
+          <w:i/>
+          <w:iCs/>
+        </w:rPr>
+        <w:t>Proc. 4th Int. Conf. Advanced Research in Computing (ICARC)</w:t>
+      </w:r>
+      <w:r>
+        <w:t>, 2024, doi: 10.1109/ICARC61713.2024.10499735.</w:t>
+      </w:r>
+    </w:p>
+    <w:p>
+      <w:pPr>
+        <w:pStyle w:val="references"/>
+        <w:ind w:start="17.70pt" w:hanging="17.70pt"/>
+      </w:pPr>
+      <w:r>
+        <w:t xml:space="preserve">N. Dinh, V. T. Hoang, B. N. Van, T. H. Huong, H. D. T. Hong, H. N. Trung, and K. T. Trung, “Enhancing Smart Contract Security Through DevSecOps: An Adaptive Approach for Vulnerability Detection,” </w:t>
+      </w:r>
+      <w:r>
+        <w:rPr>
+          <w:i/>
+          <w:iCs/>
+        </w:rPr>
+        <w:t>IEEE Access</w:t>
+      </w:r>
+      <w:r>
+        <w:t>, vol. 13, pp. 159454–159520, 2025, doi: 10.1109/ACCESS.2025.3606572.</w:t>
+      </w:r>
+    </w:p>
+    <w:p>
+      <w:pPr>
+        <w:pStyle w:val="references"/>
+        <w:ind w:start="17.70pt" w:hanging="17.70pt"/>
+      </w:pPr>
+      <w:r>
+        <w:t xml:space="preserve">R. Ashtagi, Y. Bhalerao, C. Belani, P. Bhalerao, and A. Chawle, “Building Resilient CI/CD Pipelines: A DevOps Security-First Framework,” in </w:t>
+      </w:r>
+      <w:r>
+        <w:rPr>
+          <w:i/>
+          <w:iCs/>
+        </w:rPr>
+        <w:t>Proc. 2025 Int. Conf. Computational, Communication and Information Technology (ICCCIT)</w:t>
+      </w:r>
+      <w:r>
+        <w:t>, 2025, doi: 10.1109/ICCCIT62592.2025.10927871.</w:t>
+      </w:r>
+    </w:p>
+    <w:p>
+      <w:pPr>
+        <w:pStyle w:val="references"/>
+        <w:ind w:start="17.70pt" w:hanging="17.70pt"/>
+      </w:pPr>
+      <w:r>
+        <w:t xml:space="preserve">R. C. B. Ramos and S. G. Yoo, “Cybersecurity in DevOps Environments: A Systematic Literature Review,” </w:t>
+      </w:r>
+      <w:r>
+        <w:rPr>
+          <w:i/>
+          <w:iCs/>
+        </w:rPr>
+        <w:t>IEEE Access</w:t>
+      </w:r>
+      <w:r>
+        <w:t>, vol. 13, pp. 191959–191980, 2025, doi: 10.1109/ACCESS.2025.3582892.</w:t>
+      </w:r>
+    </w:p>
+    <w:p>
+      <w:pPr>
+        <w:pStyle w:val="references"/>
+        <w:ind w:start="17.70pt" w:hanging="17.70pt"/>
+      </w:pPr>
+      <w:r>
+        <w:t xml:space="preserve">S. A. Ruk, Y. Mahmood, A. Azmi, N. F. M. Azmi, and S. Gul, “Effort Estimation in Agile and DevOps: A Systematic Literature Review of Stakeholder Dissatisfaction,” </w:t>
+      </w:r>
+      <w:r>
+        <w:rPr>
+          <w:i/>
+          <w:iCs/>
+        </w:rPr>
+        <w:t>IEEE Access</w:t>
+      </w:r>
+      <w:r>
+        <w:t>, vol. 13, pp. 167925–167960, 2025, doi: 10.1109/ACCESS.2025.3600321.</w:t>
+      </w:r>
+    </w:p>
+    <w:p>
+      <w:pPr>
+        <w:pStyle w:val="references"/>
+        <w:ind w:start="17.70pt" w:hanging="17.70pt"/>
+      </w:pPr>
+      <w:r>
+        <w:t xml:space="preserve">N. S, P. Manja, P. Mathur, and P. B. Honnavalli, “Extensive Review of Threat Models for DevSecOps,” </w:t>
+      </w:r>
+      <w:r>
+        <w:rPr>
+          <w:i/>
+          <w:iCs/>
+        </w:rPr>
+        <w:t>IEEE Access</w:t>
+      </w:r>
+      <w:r>
+        <w:t>, vol. 13, pp. 45252–45274, 2025, doi: 10.1109/ACCESS.2025.3547932.</w:t>
+      </w:r>
+    </w:p>
+    <w:p>
+      <w:pPr>
+        <w:pStyle w:val="references"/>
+        <w:ind w:start="17.70pt" w:hanging="17.70pt"/>
+      </w:pPr>
+      <w:r>
+        <w:t xml:space="preserve">M. A. Akbar and A. A. Alsanad, “Empirical Investigation of Key Enablers for Secure DevOps Practices,” </w:t>
+      </w:r>
+      <w:r>
+        <w:rPr>
+          <w:i/>
+          <w:iCs/>
+        </w:rPr>
+        <w:t>IEEE Access</w:t>
+      </w:r>
+      <w:r>
+        <w:t>, vol. 13, pp. 43698–43710, 2025, doi: 10.1109/ACCESS.2025.3549183.</w:t>
+      </w:r>
+    </w:p>
+    <w:p>
+      <w:pPr>
+        <w:pStyle w:val="references"/>
+        <w:ind w:start="17.70pt" w:hanging="17.70pt"/>
+      </w:pPr>
+      <w:r>
+        <w:t xml:space="preserve">J. Ababneh, E. Y. A. Al-Nsour, A. Al-Shaikh, M. R. Al-Mousa, A. Al-Zabin, M. Asassfeh, and H. Abualese, “Enhancing DevOps Continuous Monitoring Phase: Hybrid Intrusion Detection and Ensemble Learning System (HIDELS),” </w:t>
+      </w:r>
+      <w:r>
+        <w:rPr>
+          <w:i/>
+          <w:iCs/>
+        </w:rPr>
+        <w:t>IEEE Access</w:t>
+      </w:r>
+      <w:r>
+        <w:t>, vol. 14, pp. 4733–4755, 2026, doi: 10.1109/ACCESS.2026.3650793.</w:t>
       </w:r>
     </w:p>
     <w:p>

</xml_diff>

<commit_message>
Revise abstract and introduction in Survey Paper to enhance clarity on DevSecOps integration and security practices in CI/CD pipelines
</commit_message>
<xml_diff>
--- a/Documentation/Survey Paper/Survey-paper.docx
+++ b/Documentation/Survey Paper/Survey-paper.docx
@@ -24,24 +24,21 @@
       </w:pPr>
       <w:r>
         <w:rPr>
-          <w:b/>
-          <w:bCs/>
-          <w:sz w:val="18"/>
-          <w:szCs w:val="18"/>
+          <w:kern w:val="48"/>
         </w:rPr>
         <w:drawing>
-          <wp:anchor distT="45720" distB="45720" distL="114300" distR="114300" simplePos="0" relativeHeight="251665920" behindDoc="0" locked="0" layoutInCell="1" allowOverlap="1" wp14:anchorId="7639E3C5" wp14:editId="4E30DEA2">
+          <wp:anchor distT="45720" distB="45720" distL="114300" distR="114300" simplePos="0" relativeHeight="251671552" behindDoc="0" locked="0" layoutInCell="1" allowOverlap="1" wp14:anchorId="02FD1538" wp14:editId="1448C69E">
             <wp:simplePos x="0" y="0"/>
             <wp:positionH relativeFrom="column">
-              <wp:posOffset>3810</wp:posOffset>
+              <wp:posOffset>3408045</wp:posOffset>
             </wp:positionH>
             <wp:positionV relativeFrom="paragraph">
-              <wp:posOffset>1706880</wp:posOffset>
+              <wp:posOffset>1962150</wp:posOffset>
             </wp:positionV>
-            <wp:extent cx="3274695" cy="777240"/>
-            <wp:effectExtent l="0" t="0" r="20955" b="15240"/>
+            <wp:extent cx="2743200" cy="1028700"/>
+            <wp:effectExtent l="0" t="0" r="0" b="0"/>
             <wp:wrapSquare wrapText="bothSides"/>
-            <wp:docPr id="46397045" name="Text Box 2"/>
+            <wp:docPr id="1554678772" name="Text Box 2"/>
             <wp:cNvGraphicFramePr>
               <a:graphicFrameLocks xmlns:a="http://purl.oclc.org/ooxml/drawingml/main"/>
             </wp:cNvGraphicFramePr>
@@ -54,7 +51,7 @@
                   <wp:spPr bwMode="auto">
                     <a:xfrm>
                       <a:off x="0" y="0"/>
-                      <a:ext cx="3274695" cy="777240"/>
+                      <a:ext cx="2743200" cy="1028700"/>
                     </a:xfrm>
                     <a:prstGeom prst="rect">
                       <a:avLst/>
@@ -63,278 +60,7 @@
                       <a:srgbClr val="FFFFFF"/>
                     </a:solidFill>
                     <a:ln w="9525">
-                      <a:solidFill>
-                        <a:srgbClr val="000000"/>
-                      </a:solidFill>
-                      <a:miter lim="800%"/>
-                      <a:headEnd/>
-                      <a:tailEnd/>
-                    </a:ln>
-                  </wp:spPr>
-                  <wp:txbx>
-                    <wne:txbxContent>
-                      <w:p>
-                        <w:r>
-                          <w:rPr>
-                            <w:b/>
-                            <w:bCs/>
-                            <w:sz w:val="18"/>
-                            <w:szCs w:val="18"/>
-                          </w:rPr>
-                          <w:t>Revanth Kumar T S</w:t>
-                        </w:r>
-                        <w:r>
-                          <w:rPr>
-                            <w:sz w:val="18"/>
-                            <w:szCs w:val="18"/>
-                          </w:rPr>
-                          <w:br/>
-                          <w:t xml:space="preserve">Department of Computer Science and </w:t>
-                        </w:r>
-                        <w:r>
-                          <w:rPr>
-                            <w:sz w:val="18"/>
-                            <w:szCs w:val="18"/>
-                          </w:rPr>
-                          <w:t xml:space="preserve">  </w:t>
-                        </w:r>
-                        <w:r>
-                          <w:rPr>
-                            <w:sz w:val="18"/>
-                            <w:szCs w:val="18"/>
-                          </w:rPr>
-                          <w:t>Engineering</w:t>
-                        </w:r>
-                        <w:r>
-                          <w:rPr>
-                            <w:sz w:val="18"/>
-                            <w:szCs w:val="18"/>
-                          </w:rPr>
-                          <w:t xml:space="preserve">                              </w:t>
-                        </w:r>
-                        <w:r>
-                          <w:rPr>
-                            <w:sz w:val="18"/>
-                            <w:szCs w:val="18"/>
-                          </w:rPr>
-                          <w:br/>
-                          <w:t>Global Academy of Technology</w:t>
-                        </w:r>
-                        <w:r>
-                          <w:rPr>
-                            <w:sz w:val="18"/>
-                            <w:szCs w:val="18"/>
-                          </w:rPr>
-                          <w:br/>
-                          <w:t>Bengaluru, India</w:t>
-                        </w:r>
-                        <w:r>
-                          <w:rPr>
-                            <w:sz w:val="18"/>
-                            <w:szCs w:val="18"/>
-                          </w:rPr>
-                          <w:br/>
-                        </w:r>
-                        <w:r>
-                          <w:t>revanthkumarts123@gmail.com</w:t>
-                        </w:r>
-                      </w:p>
-                      <w:p/>
-                    </wne:txbxContent>
-                  </wp:txbx>
-                  <wp:bodyPr rot="0" vert="horz" wrap="square" lIns="91440" tIns="45720" rIns="91440" bIns="45720" anchor="t" anchorCtr="0">
-                    <a:noAutofit/>
-                  </wp:bodyPr>
-                </wp:wsp>
-              </a:graphicData>
-            </a:graphic>
-            <wp14:sizeRelH relativeFrom="margin">
-              <wp14:pctWidth>0%</wp14:pctWidth>
-            </wp14:sizeRelH>
-            <wp14:sizeRelV relativeFrom="margin">
-              <wp14:pctHeight>0%</wp14:pctHeight>
-            </wp14:sizeRelV>
-          </wp:anchor>
-        </w:drawing>
-      </w:r>
-      <w:r>
-        <w:rPr>
-          <w:b/>
-          <w:bCs/>
-          <w:sz w:val="18"/>
-          <w:szCs w:val="18"/>
-        </w:rPr>
-        <w:drawing>
-          <wp:anchor distT="45720" distB="45720" distL="114300" distR="114300" simplePos="0" relativeHeight="251663872" behindDoc="0" locked="0" layoutInCell="1" allowOverlap="1" wp14:anchorId="0D7691DA" wp14:editId="4FE03D5E">
-            <wp:simplePos x="0" y="0"/>
-            <wp:positionH relativeFrom="column">
-              <wp:posOffset>3342005</wp:posOffset>
-            </wp:positionH>
-            <wp:positionV relativeFrom="paragraph">
-              <wp:posOffset>1699260</wp:posOffset>
-            </wp:positionV>
-            <wp:extent cx="3261360" cy="1404620"/>
-            <wp:effectExtent l="0" t="0" r="15240" b="27940"/>
-            <wp:wrapSquare wrapText="bothSides"/>
-            <wp:docPr id="953592618" name="Text Box 2"/>
-            <wp:cNvGraphicFramePr>
-              <a:graphicFrameLocks xmlns:a="http://purl.oclc.org/ooxml/drawingml/main"/>
-            </wp:cNvGraphicFramePr>
-            <a:graphic xmlns:a="http://purl.oclc.org/ooxml/drawingml/main">
-              <a:graphicData uri="http://schemas.microsoft.com/office/word/2010/wordprocessingShape">
-                <wp:wsp>
-                  <wp:cNvSpPr txBox="1">
-                    <a:spLocks noChangeArrowheads="1"/>
-                  </wp:cNvSpPr>
-                  <wp:spPr bwMode="auto">
-                    <a:xfrm>
-                      <a:off x="0" y="0"/>
-                      <a:ext cx="3261360" cy="1404620"/>
-                    </a:xfrm>
-                    <a:prstGeom prst="rect">
-                      <a:avLst/>
-                    </a:prstGeom>
-                    <a:solidFill>
-                      <a:srgbClr val="FFFFFF"/>
-                    </a:solidFill>
-                    <a:ln w="9525">
-                      <a:solidFill>
-                        <a:srgbClr val="000000"/>
-                      </a:solidFill>
-                      <a:miter lim="800%"/>
-                      <a:headEnd/>
-                      <a:tailEnd/>
-                    </a:ln>
-                  </wp:spPr>
-                  <wp:txbx>
-                    <wne:txbxContent>
-                      <w:p>
-                        <w:r>
-                          <w:rPr>
-                            <w:b/>
-                            <w:bCs/>
-                            <w:sz w:val="18"/>
-                            <w:szCs w:val="18"/>
-                          </w:rPr>
-                          <w:t xml:space="preserve">Vignesh P                                                           </w:t>
-                        </w:r>
-                        <w:r>
-                          <w:rPr>
-                            <w:sz w:val="18"/>
-                            <w:szCs w:val="18"/>
-                          </w:rPr>
-                          <w:br/>
-                          <w:t xml:space="preserve">Department of Computer Science and </w:t>
-                        </w:r>
-                        <w:r>
-                          <w:rPr>
-                            <w:sz w:val="18"/>
-                            <w:szCs w:val="18"/>
-                          </w:rPr>
-                          <w:t xml:space="preserve">  </w:t>
-                        </w:r>
-                        <w:r>
-                          <w:rPr>
-                            <w:sz w:val="18"/>
-                            <w:szCs w:val="18"/>
-                          </w:rPr>
-                          <w:t>Engineering</w:t>
-                        </w:r>
-                        <w:r>
-                          <w:rPr>
-                            <w:sz w:val="18"/>
-                            <w:szCs w:val="18"/>
-                          </w:rPr>
-                          <w:t xml:space="preserve">                              </w:t>
-                        </w:r>
-                        <w:r>
-                          <w:rPr>
-                            <w:sz w:val="18"/>
-                            <w:szCs w:val="18"/>
-                          </w:rPr>
-                          <w:br/>
-                          <w:t>Global Academy of Technology</w:t>
-                        </w:r>
-                        <w:r>
-                          <w:rPr>
-                            <w:sz w:val="18"/>
-                            <w:szCs w:val="18"/>
-                          </w:rPr>
-                          <w:br/>
-                          <w:t>Bengaluru, India</w:t>
-                        </w:r>
-                        <w:r>
-                          <w:rPr>
-                            <w:sz w:val="18"/>
-                            <w:szCs w:val="18"/>
-                          </w:rPr>
-                          <w:br/>
-                        </w:r>
-                        <w:r>
-                          <w:t>palanivignesh31@gmail.com</w:t>
-                        </w:r>
-                      </w:p>
-                    </wne:txbxContent>
-                  </wp:txbx>
-                  <wp:bodyPr rot="0" vert="horz" wrap="square" lIns="91440" tIns="45720" rIns="91440" bIns="45720" anchor="t" anchorCtr="0">
-                    <a:spAutoFit/>
-                  </wp:bodyPr>
-                </wp:wsp>
-              </a:graphicData>
-            </a:graphic>
-            <wp14:sizeRelH relativeFrom="margin">
-              <wp14:pctWidth>0%</wp14:pctWidth>
-            </wp14:sizeRelH>
-            <wp14:sizeRelV relativeFrom="margin">
-              <wp14:pctHeight>20%</wp14:pctHeight>
-            </wp14:sizeRelV>
-          </wp:anchor>
-        </w:drawing>
-      </w:r>
-      <w:r>
-        <w:rPr>
-          <w:b/>
-          <w:bCs/>
-          <w:sz w:val="18"/>
-          <w:szCs w:val="18"/>
-        </w:rPr>
-        <w:drawing>
-          <wp:anchor distT="45720" distB="45720" distL="114300" distR="114300" simplePos="0" relativeHeight="251661824" behindDoc="0" locked="0" layoutInCell="1" allowOverlap="1" wp14:anchorId="1D387E36" wp14:editId="5ADB97BC">
-            <wp:simplePos x="0" y="0"/>
-            <wp:positionH relativeFrom="column">
-              <wp:posOffset>3337894</wp:posOffset>
-            </wp:positionH>
-            <wp:positionV relativeFrom="paragraph">
-              <wp:posOffset>791640</wp:posOffset>
-            </wp:positionV>
-            <wp:extent cx="3249930" cy="1404620"/>
-            <wp:effectExtent l="0" t="0" r="26670" b="23495"/>
-            <wp:wrapSquare wrapText="bothSides"/>
-            <wp:docPr id="1910768202" name="Text Box 2"/>
-            <wp:cNvGraphicFramePr>
-              <a:graphicFrameLocks xmlns:a="http://purl.oclc.org/ooxml/drawingml/main"/>
-            </wp:cNvGraphicFramePr>
-            <a:graphic xmlns:a="http://purl.oclc.org/ooxml/drawingml/main">
-              <a:graphicData uri="http://schemas.microsoft.com/office/word/2010/wordprocessingShape">
-                <wp:wsp>
-                  <wp:cNvSpPr txBox="1">
-                    <a:spLocks noChangeArrowheads="1"/>
-                  </wp:cNvSpPr>
-                  <wp:spPr bwMode="auto">
-                    <a:xfrm>
-                      <a:off x="0" y="0"/>
-                      <a:ext cx="3249930" cy="1404620"/>
-                    </a:xfrm>
-                    <a:prstGeom prst="rect">
-                      <a:avLst/>
-                    </a:prstGeom>
-                    <a:solidFill>
-                      <a:srgbClr val="FFFFFF"/>
-                    </a:solidFill>
-                    <a:ln w="9525">
-                      <a:solidFill>
-                        <a:srgbClr val="000000"/>
-                      </a:solidFill>
+                      <a:noFill/>
                       <a:miter lim="800%"/>
                       <a:headEnd/>
                       <a:tailEnd/>
@@ -345,213 +71,39 @@
                       <w:p>
                         <w:pPr>
                           <w:rPr>
-                            <w:sz w:val="18"/>
-                            <w:szCs w:val="18"/>
+                            <w:b/>
+                            <w:bCs/>
                           </w:rPr>
                         </w:pPr>
                         <w:r>
                           <w:rPr>
                             <w:b/>
                             <w:bCs/>
-                            <w:sz w:val="18"/>
-                            <w:szCs w:val="18"/>
                           </w:rPr>
-                          <w:t>Sanket</w:t>
-                        </w:r>
-                        <w:r>
-                          <w:rPr>
-                            <w:sz w:val="18"/>
-                            <w:szCs w:val="18"/>
-                          </w:rPr>
-                          <w:br/>
-                          <w:t xml:space="preserve">Department of Computer Science and </w:t>
-                        </w:r>
-                        <w:r>
-                          <w:rPr>
-                            <w:sz w:val="18"/>
-                            <w:szCs w:val="18"/>
-                          </w:rPr>
-                          <w:t xml:space="preserve">  </w:t>
-                        </w:r>
-                        <w:r>
-                          <w:rPr>
-                            <w:sz w:val="18"/>
-                            <w:szCs w:val="18"/>
-                          </w:rPr>
-                          <w:t>Engineering</w:t>
-                        </w:r>
-                        <w:r>
-                          <w:rPr>
-                            <w:sz w:val="18"/>
-                            <w:szCs w:val="18"/>
-                          </w:rPr>
-                          <w:t xml:space="preserve">                              </w:t>
-                        </w:r>
-                        <w:r>
-                          <w:rPr>
-                            <w:sz w:val="18"/>
-                            <w:szCs w:val="18"/>
-                          </w:rPr>
-                          <w:br/>
-                          <w:t>Global Academy of Technology</w:t>
-                        </w:r>
-                        <w:r>
-                          <w:rPr>
-                            <w:sz w:val="18"/>
-                            <w:szCs w:val="18"/>
-                          </w:rPr>
-                          <w:br/>
-                          <w:t>Bengaluru, India</w:t>
+                          <w:t>Sameena H S</w:t>
                         </w:r>
                       </w:p>
                       <w:p>
                         <w:r>
-                          <w:rPr>
-                            <w:sz w:val="18"/>
-                            <w:szCs w:val="18"/>
-                          </w:rPr>
-                          <w:t>sankethcoding@gmail.com</w:t>
+                          <w:t xml:space="preserve">Department of Computer Science and Engineering </w:t>
                         </w:r>
                       </w:p>
-                    </wne:txbxContent>
-                  </wp:txbx>
-                  <wp:bodyPr rot="0" vert="horz" wrap="square" lIns="91440" tIns="45720" rIns="91440" bIns="45720" anchor="t" anchorCtr="0">
-                    <a:spAutoFit/>
-                  </wp:bodyPr>
-                </wp:wsp>
-              </a:graphicData>
-            </a:graphic>
-            <wp14:sizeRelH relativeFrom="margin">
-              <wp14:pctWidth>0%</wp14:pctWidth>
-            </wp14:sizeRelH>
-            <wp14:sizeRelV relativeFrom="margin">
-              <wp14:pctHeight>20%</wp14:pctHeight>
-            </wp14:sizeRelV>
-          </wp:anchor>
-        </w:drawing>
-      </w:r>
-      <w:r>
-        <w:rPr>
-          <w:b/>
-          <w:bCs/>
-          <w:sz w:val="18"/>
-          <w:szCs w:val="18"/>
-        </w:rPr>
-        <w:drawing>
-          <wp:anchor distT="45720" distB="45720" distL="114300" distR="114300" simplePos="0" relativeHeight="251659776" behindDoc="0" locked="0" layoutInCell="1" allowOverlap="1" wp14:anchorId="23649975" wp14:editId="6C6BE891">
-            <wp:simplePos x="0" y="0"/>
-            <wp:positionH relativeFrom="margin">
-              <wp:align>left</wp:align>
-            </wp:positionH>
-            <wp:positionV relativeFrom="paragraph">
-              <wp:posOffset>782750</wp:posOffset>
-            </wp:positionV>
-            <wp:extent cx="3282315" cy="765810"/>
-            <wp:effectExtent l="0" t="0" r="13335" b="15240"/>
-            <wp:wrapSquare wrapText="bothSides"/>
-            <wp:docPr id="217" name="Text Box 2"/>
-            <wp:cNvGraphicFramePr>
-              <a:graphicFrameLocks xmlns:a="http://purl.oclc.org/ooxml/drawingml/main"/>
-            </wp:cNvGraphicFramePr>
-            <a:graphic xmlns:a="http://purl.oclc.org/ooxml/drawingml/main">
-              <a:graphicData uri="http://schemas.microsoft.com/office/word/2010/wordprocessingShape">
-                <wp:wsp>
-                  <wp:cNvSpPr txBox="1">
-                    <a:spLocks noChangeArrowheads="1"/>
-                  </wp:cNvSpPr>
-                  <wp:spPr bwMode="auto">
-                    <a:xfrm>
-                      <a:off x="0" y="0"/>
-                      <a:ext cx="3282315" cy="765810"/>
-                    </a:xfrm>
-                    <a:prstGeom prst="rect">
-                      <a:avLst/>
-                    </a:prstGeom>
-                    <a:solidFill>
-                      <a:srgbClr val="FFFFFF"/>
-                    </a:solidFill>
-                    <a:ln w="9525">
-                      <a:solidFill>
-                        <a:srgbClr val="000000"/>
-                      </a:solidFill>
-                      <a:miter lim="800%"/>
-                      <a:headEnd/>
-                      <a:tailEnd/>
-                    </a:ln>
-                  </wp:spPr>
-                  <wp:txbx>
-                    <wne:txbxContent>
                       <w:p>
                         <w:r>
-                          <w:rPr>
-                            <w:b/>
-                            <w:bCs/>
-                            <w:sz w:val="18"/>
-                            <w:szCs w:val="18"/>
-                          </w:rPr>
-                          <w:t>Shakthi Vel K</w:t>
+                          <w:t xml:space="preserve">Global Academy of Technology </w:t>
+                        </w:r>
+                      </w:p>
+                      <w:p>
+                        <w:r>
+                          <w:t xml:space="preserve">Bengaluru, India </w:t>
+                        </w:r>
+                      </w:p>
+                      <w:p>
+                        <w:r>
+                          <w:t>s</w:t>
                         </w:r>
                         <w:r>
-                          <w:rPr>
-                            <w:b/>
-                            <w:bCs/>
-                            <w:sz w:val="18"/>
-                            <w:szCs w:val="18"/>
-                          </w:rPr>
-                          <w:t xml:space="preserve">                                                           </w:t>
-                        </w:r>
-                        <w:r>
-                          <w:rPr>
-                            <w:sz w:val="18"/>
-                            <w:szCs w:val="18"/>
-                          </w:rPr>
-                          <w:br/>
-                          <w:t xml:space="preserve">Department of Computer Science and </w:t>
-                        </w:r>
-                        <w:r>
-                          <w:rPr>
-                            <w:sz w:val="18"/>
-                            <w:szCs w:val="18"/>
-                          </w:rPr>
-                          <w:t xml:space="preserve">  </w:t>
-                        </w:r>
-                        <w:r>
-                          <w:rPr>
-                            <w:sz w:val="18"/>
-                            <w:szCs w:val="18"/>
-                          </w:rPr>
-                          <w:t>Engineering</w:t>
-                        </w:r>
-                        <w:r>
-                          <w:rPr>
-                            <w:sz w:val="18"/>
-                            <w:szCs w:val="18"/>
-                          </w:rPr>
-                          <w:t xml:space="preserve">                              </w:t>
-                        </w:r>
-                        <w:r>
-                          <w:rPr>
-                            <w:sz w:val="18"/>
-                            <w:szCs w:val="18"/>
-                          </w:rPr>
-                          <w:br/>
-                          <w:t>Global Academy of Technology</w:t>
-                        </w:r>
-                        <w:r>
-                          <w:rPr>
-                            <w:sz w:val="18"/>
-                            <w:szCs w:val="18"/>
-                          </w:rPr>
-                          <w:br/>
-                          <w:t>Bengaluru, India</w:t>
-                        </w:r>
-                        <w:r>
-                          <w:rPr>
-                            <w:sz w:val="18"/>
-                            <w:szCs w:val="18"/>
-                          </w:rPr>
-                          <w:br/>
-                          <w:t>shakthivelk1124@gmail.com</w:t>
+                          <w:t>ameena.hs@gat.ac.in</w:t>
                         </w:r>
                       </w:p>
                     </wne:txbxContent>
@@ -575,6 +127,99 @@
         <w:rPr>
           <w:kern w:val="48"/>
         </w:rPr>
+        <w:drawing>
+          <wp:anchor distT="45720" distB="45720" distL="114300" distR="114300" simplePos="0" relativeHeight="251669504" behindDoc="0" locked="0" layoutInCell="1" allowOverlap="1" wp14:anchorId="4CDE5512" wp14:editId="50EC342D">
+            <wp:simplePos x="0" y="0"/>
+            <wp:positionH relativeFrom="column">
+              <wp:posOffset>4544695</wp:posOffset>
+            </wp:positionH>
+            <wp:positionV relativeFrom="paragraph">
+              <wp:posOffset>882650</wp:posOffset>
+            </wp:positionV>
+            <wp:extent cx="2387600" cy="1066800"/>
+            <wp:effectExtent l="0" t="0" r="0" b="0"/>
+            <wp:wrapSquare wrapText="bothSides"/>
+            <wp:docPr id="1968643638" name="Text Box 2"/>
+            <wp:cNvGraphicFramePr>
+              <a:graphicFrameLocks xmlns:a="http://purl.oclc.org/ooxml/drawingml/main"/>
+            </wp:cNvGraphicFramePr>
+            <a:graphic xmlns:a="http://purl.oclc.org/ooxml/drawingml/main">
+              <a:graphicData uri="http://schemas.microsoft.com/office/word/2010/wordprocessingShape">
+                <wp:wsp>
+                  <wp:cNvSpPr txBox="1">
+                    <a:spLocks noChangeArrowheads="1"/>
+                  </wp:cNvSpPr>
+                  <wp:spPr bwMode="auto">
+                    <a:xfrm>
+                      <a:off x="0" y="0"/>
+                      <a:ext cx="2387600" cy="1066800"/>
+                    </a:xfrm>
+                    <a:prstGeom prst="rect">
+                      <a:avLst/>
+                    </a:prstGeom>
+                    <a:solidFill>
+                      <a:srgbClr val="FFFFFF"/>
+                    </a:solidFill>
+                    <a:ln w="9525">
+                      <a:noFill/>
+                      <a:miter lim="800%"/>
+                      <a:headEnd/>
+                      <a:tailEnd/>
+                    </a:ln>
+                  </wp:spPr>
+                  <wp:txbx>
+                    <wne:txbxContent>
+                      <w:p>
+                        <w:pPr>
+                          <w:rPr>
+                            <w:b/>
+                            <w:bCs/>
+                          </w:rPr>
+                        </w:pPr>
+                        <w:r>
+                          <w:rPr>
+                            <w:b/>
+                            <w:bCs/>
+                          </w:rPr>
+                          <w:t>Vignesh P</w:t>
+                        </w:r>
+                      </w:p>
+                      <w:p>
+                        <w:r>
+                          <w:t xml:space="preserve">Department of Computer Science and Engineering </w:t>
+                        </w:r>
+                      </w:p>
+                      <w:p>
+                        <w:r>
+                          <w:t xml:space="preserve">Global Academy of Technology Bengaluru, India </w:t>
+                        </w:r>
+                      </w:p>
+                      <w:p>
+                        <w:r>
+                          <w:t>palanivignesh31@gmail.com</w:t>
+                        </w:r>
+                      </w:p>
+                    </wne:txbxContent>
+                  </wp:txbx>
+                  <wp:bodyPr rot="0" vert="horz" wrap="square" lIns="91440" tIns="45720" rIns="91440" bIns="45720" anchor="t" anchorCtr="0">
+                    <a:noAutofit/>
+                  </wp:bodyPr>
+                </wp:wsp>
+              </a:graphicData>
+            </a:graphic>
+            <wp14:sizeRelH relativeFrom="margin">
+              <wp14:pctWidth>0%</wp14:pctWidth>
+            </wp14:sizeRelH>
+            <wp14:sizeRelV relativeFrom="margin">
+              <wp14:pctHeight>0%</wp14:pctHeight>
+            </wp14:sizeRelV>
+          </wp:anchor>
+        </w:drawing>
+      </w:r>
+      <w:r>
+        <w:rPr>
+          <w:kern w:val="48"/>
+        </w:rPr>
         <w:t>Implementation of a Secure DevOps CI/CD Pipeline Using DevSecOps Too</w:t>
       </w:r>
       <w:r>
@@ -603,6 +248,202 @@
           <w:docGrid w:linePitch="360"/>
         </w:sectPr>
       </w:pPr>
+      <w:r>
+        <w:rPr>
+          <w:kern w:val="48"/>
+        </w:rPr>
+        <w:drawing>
+          <wp:anchor distT="45720" distB="45720" distL="114300" distR="114300" simplePos="0" relativeHeight="251667456" behindDoc="0" locked="0" layoutInCell="1" allowOverlap="1" wp14:anchorId="110D35D1" wp14:editId="6508C372">
+            <wp:simplePos x="0" y="0"/>
+            <wp:positionH relativeFrom="column">
+              <wp:posOffset>2042795</wp:posOffset>
+            </wp:positionH>
+            <wp:positionV relativeFrom="paragraph">
+              <wp:posOffset>3810</wp:posOffset>
+            </wp:positionV>
+            <wp:extent cx="2514600" cy="1085850"/>
+            <wp:effectExtent l="0" t="0" r="0" b="0"/>
+            <wp:wrapSquare wrapText="bothSides"/>
+            <wp:docPr id="1440849309" name="Text Box 2"/>
+            <wp:cNvGraphicFramePr>
+              <a:graphicFrameLocks xmlns:a="http://purl.oclc.org/ooxml/drawingml/main"/>
+            </wp:cNvGraphicFramePr>
+            <a:graphic xmlns:a="http://purl.oclc.org/ooxml/drawingml/main">
+              <a:graphicData uri="http://schemas.microsoft.com/office/word/2010/wordprocessingShape">
+                <wp:wsp>
+                  <wp:cNvSpPr txBox="1">
+                    <a:spLocks noChangeArrowheads="1"/>
+                  </wp:cNvSpPr>
+                  <wp:spPr bwMode="auto">
+                    <a:xfrm>
+                      <a:off x="0" y="0"/>
+                      <a:ext cx="2514600" cy="1085850"/>
+                    </a:xfrm>
+                    <a:prstGeom prst="rect">
+                      <a:avLst/>
+                    </a:prstGeom>
+                    <a:solidFill>
+                      <a:srgbClr val="FFFFFF"/>
+                    </a:solidFill>
+                    <a:ln w="9525">
+                      <a:noFill/>
+                      <a:miter lim="800%"/>
+                      <a:headEnd/>
+                      <a:tailEnd/>
+                    </a:ln>
+                  </wp:spPr>
+                  <wp:txbx>
+                    <wne:txbxContent>
+                      <w:p>
+                        <w:pPr>
+                          <w:rPr>
+                            <w:b/>
+                            <w:bCs/>
+                          </w:rPr>
+                        </w:pPr>
+                        <w:r>
+                          <w:rPr>
+                            <w:b/>
+                            <w:bCs/>
+                          </w:rPr>
+                          <w:t>Sanket</w:t>
+                        </w:r>
+                      </w:p>
+                      <w:p>
+                        <w:r>
+                          <w:t xml:space="preserve">Department of Computer Science and Engineering </w:t>
+                        </w:r>
+                      </w:p>
+                      <w:p>
+                        <w:r>
+                          <w:t xml:space="preserve">Global Academy of Technology </w:t>
+                        </w:r>
+                      </w:p>
+                      <w:p>
+                        <w:r>
+                          <w:t xml:space="preserve">Bengaluru, India </w:t>
+                        </w:r>
+                      </w:p>
+                      <w:p>
+                        <w:r>
+                          <w:t>sankethcoding@gmail.com</w:t>
+                        </w:r>
+                      </w:p>
+                    </wne:txbxContent>
+                  </wp:txbx>
+                  <wp:bodyPr rot="0" vert="horz" wrap="square" lIns="91440" tIns="45720" rIns="91440" bIns="45720" anchor="t" anchorCtr="0">
+                    <a:noAutofit/>
+                  </wp:bodyPr>
+                </wp:wsp>
+              </a:graphicData>
+            </a:graphic>
+            <wp14:sizeRelH relativeFrom="margin">
+              <wp14:pctWidth>0%</wp14:pctWidth>
+            </wp14:sizeRelH>
+            <wp14:sizeRelV relativeFrom="margin">
+              <wp14:pctHeight>0%</wp14:pctHeight>
+            </wp14:sizeRelV>
+          </wp:anchor>
+        </w:drawing>
+      </w:r>
+      <w:r>
+        <w:rPr>
+          <w:kern w:val="48"/>
+        </w:rPr>
+        <w:drawing>
+          <wp:anchor distT="45720" distB="45720" distL="114300" distR="114300" simplePos="0" relativeHeight="251659264" behindDoc="0" locked="0" layoutInCell="1" allowOverlap="1" wp14:anchorId="41F343B1" wp14:editId="22E463B4">
+            <wp:simplePos x="0" y="0"/>
+            <wp:positionH relativeFrom="page">
+              <wp:align>left</wp:align>
+            </wp:positionH>
+            <wp:positionV relativeFrom="paragraph">
+              <wp:posOffset>3810</wp:posOffset>
+            </wp:positionV>
+            <wp:extent cx="2628900" cy="1117600"/>
+            <wp:effectExtent l="0" t="0" r="0" b="6350"/>
+            <wp:wrapSquare wrapText="bothSides"/>
+            <wp:docPr id="217" name="Text Box 2"/>
+            <wp:cNvGraphicFramePr>
+              <a:graphicFrameLocks xmlns:a="http://purl.oclc.org/ooxml/drawingml/main"/>
+            </wp:cNvGraphicFramePr>
+            <a:graphic xmlns:a="http://purl.oclc.org/ooxml/drawingml/main">
+              <a:graphicData uri="http://schemas.microsoft.com/office/word/2010/wordprocessingShape">
+                <wp:wsp>
+                  <wp:cNvSpPr txBox="1">
+                    <a:spLocks noChangeArrowheads="1"/>
+                  </wp:cNvSpPr>
+                  <wp:spPr bwMode="auto">
+                    <a:xfrm>
+                      <a:off x="0" y="0"/>
+                      <a:ext cx="2628900" cy="1117600"/>
+                    </a:xfrm>
+                    <a:prstGeom prst="rect">
+                      <a:avLst/>
+                    </a:prstGeom>
+                    <a:solidFill>
+                      <a:srgbClr val="FFFFFF"/>
+                    </a:solidFill>
+                    <a:ln w="9525">
+                      <a:noFill/>
+                      <a:miter lim="800%"/>
+                      <a:headEnd/>
+                      <a:tailEnd/>
+                    </a:ln>
+                  </wp:spPr>
+                  <wp:txbx>
+                    <wne:txbxContent>
+                      <w:p>
+                        <w:pPr>
+                          <w:rPr>
+                            <w:b/>
+                            <w:bCs/>
+                          </w:rPr>
+                        </w:pPr>
+                        <w:r>
+                          <w:rPr>
+                            <w:b/>
+                            <w:bCs/>
+                          </w:rPr>
+                          <w:t>Revanth Kumar T S</w:t>
+                        </w:r>
+                      </w:p>
+                      <w:p>
+                        <w:r>
+                          <w:t>Department of Computer Science and Engineering</w:t>
+                        </w:r>
+                      </w:p>
+                      <w:p>
+                        <w:r>
+                          <w:t xml:space="preserve">Global Academy of Technology </w:t>
+                        </w:r>
+                      </w:p>
+                      <w:p>
+                        <w:r>
+                          <w:t>Bengaluru, India</w:t>
+                        </w:r>
+                      </w:p>
+                      <w:p>
+                        <w:r>
+                          <w:t xml:space="preserve"> revanthkumarts123@gmail.com</w:t>
+                        </w:r>
+                      </w:p>
+                    </wne:txbxContent>
+                  </wp:txbx>
+                  <wp:bodyPr rot="0" vert="horz" wrap="square" lIns="91440" tIns="45720" rIns="91440" bIns="45720" anchor="t" anchorCtr="0">
+                    <a:noAutofit/>
+                  </wp:bodyPr>
+                </wp:wsp>
+              </a:graphicData>
+            </a:graphic>
+            <wp14:sizeRelH relativeFrom="margin">
+              <wp14:pctWidth>0%</wp14:pctWidth>
+            </wp14:sizeRelH>
+            <wp14:sizeRelV relativeFrom="margin">
+              <wp14:pctHeight>0%</wp14:pctHeight>
+            </wp14:sizeRelV>
+          </wp:anchor>
+        </w:drawing>
+      </w:r>
     </w:p>
     <w:p>
       <w:pPr>
@@ -625,28 +466,136 @@
           <w:iCs/>
         </w:rPr>
       </w:pPr>
+      <w:r>
+        <w:rPr>
+          <w:noProof/>
+          <w:kern w:val="48"/>
+        </w:rPr>
+        <w:drawing>
+          <wp:anchor distT="45720" distB="45720" distL="114300" distR="114300" simplePos="0" relativeHeight="251665408" behindDoc="0" locked="0" layoutInCell="1" allowOverlap="1" wp14:anchorId="02AAAAF2" wp14:editId="604EFF5D">
+            <wp:simplePos x="0" y="0"/>
+            <wp:positionH relativeFrom="column">
+              <wp:posOffset>99060</wp:posOffset>
+            </wp:positionH>
+            <wp:positionV relativeFrom="paragraph">
+              <wp:posOffset>786765</wp:posOffset>
+            </wp:positionV>
+            <wp:extent cx="2360930" cy="1404620"/>
+            <wp:effectExtent l="0" t="0" r="8255" b="0"/>
+            <wp:wrapSquare wrapText="bothSides"/>
+            <wp:docPr id="1119878436" name="Text Box 2"/>
+            <wp:cNvGraphicFramePr>
+              <a:graphicFrameLocks xmlns:a="http://purl.oclc.org/ooxml/drawingml/main"/>
+            </wp:cNvGraphicFramePr>
+            <a:graphic xmlns:a="http://purl.oclc.org/ooxml/drawingml/main">
+              <a:graphicData uri="http://schemas.microsoft.com/office/word/2010/wordprocessingShape">
+                <wp:wsp>
+                  <wp:cNvSpPr txBox="1">
+                    <a:spLocks noChangeArrowheads="1"/>
+                  </wp:cNvSpPr>
+                  <wp:spPr bwMode="auto">
+                    <a:xfrm>
+                      <a:off x="0" y="0"/>
+                      <a:ext cx="2360930" cy="1404620"/>
+                    </a:xfrm>
+                    <a:prstGeom prst="rect">
+                      <a:avLst/>
+                    </a:prstGeom>
+                    <a:solidFill>
+                      <a:srgbClr val="FFFFFF"/>
+                    </a:solidFill>
+                    <a:ln w="9525">
+                      <a:noFill/>
+                      <a:miter lim="800%"/>
+                      <a:headEnd/>
+                      <a:tailEnd/>
+                    </a:ln>
+                  </wp:spPr>
+                  <wp:txbx>
+                    <wne:txbxContent>
+                      <w:p>
+                        <w:pPr>
+                          <w:rPr>
+                            <w:b/>
+                            <w:bCs/>
+                          </w:rPr>
+                        </w:pPr>
+                        <w:r>
+                          <w:rPr>
+                            <w:b/>
+                            <w:bCs/>
+                          </w:rPr>
+                          <w:t>Shakthi Vel K</w:t>
+                        </w:r>
+                      </w:p>
+                      <w:p>
+                        <w:r>
+                          <w:t xml:space="preserve">Department of Computer Science and Engineering </w:t>
+                        </w:r>
+                      </w:p>
+                      <w:p>
+                        <w:r>
+                          <w:t xml:space="preserve">Global Academy of Technology </w:t>
+                        </w:r>
+                      </w:p>
+                      <w:p>
+                        <w:r>
+                          <w:t xml:space="preserve">Bengaluru, India </w:t>
+                        </w:r>
+                      </w:p>
+                      <w:p>
+                        <w:r>
+                          <w:t>shakthivelk1124</w:t>
+                        </w:r>
+                        <w:r>
+                          <w:t>@gmail.com</w:t>
+                        </w:r>
+                      </w:p>
+                    </wne:txbxContent>
+                  </wp:txbx>
+                  <wp:bodyPr rot="0" vert="horz" wrap="square" lIns="91440" tIns="45720" rIns="91440" bIns="45720" anchor="t" anchorCtr="0">
+                    <a:spAutoFit/>
+                  </wp:bodyPr>
+                </wp:wsp>
+              </a:graphicData>
+            </a:graphic>
+            <wp14:sizeRelH relativeFrom="margin">
+              <wp14:pctWidth>40%</wp14:pctWidth>
+            </wp14:sizeRelH>
+            <wp14:sizeRelV relativeFrom="margin">
+              <wp14:pctHeight>20%</wp14:pctHeight>
+            </wp14:sizeRelV>
+          </wp:anchor>
+        </w:drawing>
+      </w:r>
     </w:p>
     <w:p>
       <w:pPr>
         <w:pStyle w:val="Abstract"/>
-        <w:ind w:firstLine="0pt"/>
+      </w:pPr>
+      <w:r>
         <w:rPr>
           <w:i/>
           <w:iCs/>
         </w:rPr>
-      </w:pPr>
-      <w:r>
-        <w:rPr>
-          <w:i/>
-          <w:iCs/>
-        </w:rPr>
         <w:t>Abstract</w:t>
       </w:r>
       <w:r>
         <w:t>—</w:t>
       </w:r>
       <w:r>
-        <w:t xml:space="preserve">The rapid growth of software development has increased the need for faster and more secure deployment practices. DevOps enables continuous integration and continuous delivery of applications, but security vulnerabilities may arise if security is not integrated into the pipeline. </w:t>
+        <w:rPr>
+          <w:rFonts w:eastAsia="Times New Roman"/>
+          <w:b w:val="0"/>
+          <w:bCs w:val="0"/>
+          <w:sz w:val="24"/>
+          <w:szCs w:val="24"/>
+          <w:lang w:val="en-IN" w:eastAsia="en-IN"/>
+        </w:rPr>
+        <w:t xml:space="preserve"> </w:t>
+      </w:r>
+      <w:r>
+        <w:t xml:space="preserve">Rapid software delivery has become essential for modern applications, especially in cloud-based environments where scalability and reliability are critical. DevOps practices support faster development cycles by automating integration, testing, and deployment activities. However, when security mechanisms are not embedded within these automated workflows, applications may become exposed to potential vulnerabilities. </w:t>
       </w:r>
       <w:proofErr w:type="spellStart"/>
       <w:r>
@@ -654,59 +603,90 @@
       </w:r>
       <w:proofErr w:type="spellEnd"/>
       <w:r>
-        <w:t xml:space="preserve"> integrates security practices into every phase of the DevOps lifecycle to ensure secure software development and deployment. This paper presents the implementation of a Secure DevOps CI/CD pipeline that integrates security scanning, containerization, and continuous monitoring. The proposed system uses tools such as Git, GitHub, Jenkins, Docker, Kubernetes, Terraform, SonarQube, OWASP ZAP, </w:t>
-      </w:r>
-      <w:proofErr w:type="spellStart"/>
-      <w:r>
-        <w:t>Trivy</w:t>
-      </w:r>
-      <w:proofErr w:type="spellEnd"/>
-      <w:r>
-        <w:t>, Prometheus, and Grafana to automate the development and security processes. The pipeline detects vulnerabilities early in the development lifecycle and provides continuous monitoring to improve application security and reliability.</w:t>
+        <w:t xml:space="preserve"> addresses this challenge by integrating security validation directly into the software delivery pipeline.</w:t>
       </w:r>
     </w:p>
     <w:p>
       <w:pPr>
-        <w:pStyle w:val="Keywords"/>
-      </w:pPr>
-      <w:r>
-        <w:t>Keywords—</w:t>
-      </w:r>
-      <w:r>
-        <w:rPr>
-          <w:b w:val="0"/>
-          <w:bCs w:val="0"/>
-          <w:i w:val="0"/>
-          <w:sz w:val="20"/>
-          <w:szCs w:val="20"/>
-        </w:rPr>
-        <w:t xml:space="preserve"> </w:t>
-      </w:r>
-      <w:r>
-        <w:t xml:space="preserve">DevOps, </w:t>
+        <w:pStyle w:val="Abstract"/>
+      </w:pPr>
+      <w:r>
+        <w:t xml:space="preserve">This work presents a secure CI/CD framework that combines automated code analysis, container-based deployment, and continuous system monitoring. The implementation incorporates widely used tools such as Git, Jenkins, Docker, Kubernetes, SonarQube, OWASP ZAP, </w:t>
       </w:r>
       <w:proofErr w:type="spellStart"/>
       <w:r>
-        <w:t>DevSecOps</w:t>
+        <w:t>Trivy</w:t>
       </w:r>
       <w:proofErr w:type="spellEnd"/>
       <w:r>
-        <w:t>, CI/CD Pipeline, Security Automation, Vulnerability Scanning</w:t>
+        <w:t>, Prometheus, and Grafana to support development, security assessment, and operational monitoring. By introducing automated security checks at multiple stages of the pipeline, the proposed approach enables earlier vulnerability detection and improves the reliability of application deployment.</w:t>
       </w:r>
     </w:p>
     <w:p>
       <w:pPr>
-        <w:pStyle w:val="Heading1"/>
-        <w:rPr>
+        <w:spacing w:before="5pt" w:beforeAutospacing="1" w:after="5pt" w:afterAutospacing="1"/>
+        <w:jc w:val="start"/>
+        <w:rPr>
+          <w:rFonts w:eastAsia="Times New Roman"/>
+          <w:sz w:val="18"/>
+          <w:szCs w:val="18"/>
+          <w:lang w:val="en-IN" w:eastAsia="en-IN"/>
+        </w:rPr>
+      </w:pPr>
+      <w:r>
+        <w:rPr>
+          <w:rFonts w:eastAsia="Times New Roman"/>
           <w:b/>
           <w:bCs/>
-        </w:rPr>
-      </w:pPr>
-      <w:r>
+          <w:sz w:val="18"/>
+          <w:szCs w:val="18"/>
+          <w:lang w:val="en-IN" w:eastAsia="en-IN"/>
+        </w:rPr>
+        <w:t>Keywords—</w:t>
+      </w:r>
+      <w:r>
+        <w:rPr>
+          <w:rFonts w:eastAsia="Times New Roman"/>
+          <w:sz w:val="18"/>
+          <w:szCs w:val="18"/>
+          <w:lang w:val="en-IN" w:eastAsia="en-IN"/>
+        </w:rPr>
+        <w:t xml:space="preserve"> DevOps, </w:t>
+      </w:r>
+      <w:proofErr w:type="spellStart"/>
+      <w:r>
+        <w:rPr>
+          <w:rFonts w:eastAsia="Times New Roman"/>
+          <w:sz w:val="18"/>
+          <w:szCs w:val="18"/>
+          <w:lang w:val="en-IN" w:eastAsia="en-IN"/>
+        </w:rPr>
+        <w:t>DevSecOps</w:t>
+      </w:r>
+      <w:proofErr w:type="spellEnd"/>
+      <w:r>
+        <w:rPr>
+          <w:rFonts w:eastAsia="Times New Roman"/>
+          <w:sz w:val="18"/>
+          <w:szCs w:val="18"/>
+          <w:lang w:val="en-IN" w:eastAsia="en-IN"/>
+        </w:rPr>
+        <w:t>, CI/CD Pipeline, Security Automation, Vulnerability Detection.</w:t>
+      </w:r>
+    </w:p>
+    <w:p>
+      <w:pPr>
+        <w:pStyle w:val="Heading1"/>
         <w:rPr>
           <w:b/>
           <w:bCs/>
         </w:rPr>
+      </w:pPr>
+      <w:r>
+        <w:rPr>
+          <w:b/>
+          <w:bCs/>
+        </w:rPr>
         <w:t>Introduction</w:t>
       </w:r>
     </w:p>
@@ -721,7 +701,7 @@
         <w:rPr>
           <w:lang w:val="en-US"/>
         </w:rPr>
-        <w:t>Modern software development requires rapid deployment, scalability, and continuous delivery of applications. DevOps is a software development methodology that integrates development and operations teams to improve collaboration and automate the software delivery process. Continuous Integration (CI) and Continuous Deployment (CD) pipelines allow organizations to build, test, and deploy applications quickly and efficiently.</w:t>
+        <w:t>Delivering software in modern computing environments requires development practices that support frequent updates, dependable performance, and scalable deployment. To achieve these goals, many organizations use DevOps-based workflows that connect development activities with operational management. This approach emphasizes automation and coordinated processes for tasks such as code integration, testing, and application release. Automated pipelines help ensure that updates move from development to production in a structured and efficient manner.</w:t>
       </w:r>
     </w:p>
     <w:p>
@@ -735,7 +715,7 @@
         <w:rPr>
           <w:lang w:val="en-US"/>
         </w:rPr>
-        <w:t xml:space="preserve">However, traditional DevOps pipelines often overlook security concerns, which may lead to vulnerabilities in deployed applications. To address this problem, </w:t>
+        <w:t xml:space="preserve">While these pipelines improve delivery speed, insufficient attention to security can introduce risks into deployed systems. </w:t>
       </w:r>
       <w:proofErr w:type="spellStart"/>
       <w:r>
@@ -749,7 +729,7 @@
         <w:rPr>
           <w:lang w:val="en-US"/>
         </w:rPr>
-        <w:t xml:space="preserve"> integrates security practices directly into the DevOps pipeline. By embedding security tools and automated vulnerability scanning into the development lifecycle, organizations can detect and mitigate security risks early.</w:t>
+        <w:t xml:space="preserve"> extends the DevOps model by incorporating security verification throughout the software lifecycle. By integrating automated analysis tools, vulnerability detection mechanisms, and monitoring systems, security issues can be discovered earlier. This proactive integration strengthens application protection while maintaining the advantages of automated software delivery.</w:t>
       </w:r>
     </w:p>
     <w:p>
@@ -848,6 +828,25 @@
           <w:iCs w:val="0"/>
         </w:rPr>
         <w:t>Security scanning tools such as OWASP ZAP and Trivy are integrated into the pipeline to detect vulnerabilities in applications and container images. Docker is used to package applications into containers, ensuring consistent deployment across environments. Kubernetes manages and orchestrates these containers to provide scalability and reliability.</w:t>
+      </w:r>
+    </w:p>
+    <w:p>
+      <w:pPr>
+        <w:rPr>
+          <w:b/>
+          <w:bCs/>
+          <w:sz w:val="18"/>
+          <w:szCs w:val="18"/>
+        </w:rPr>
+      </w:pPr>
+      <w:r>
+        <w:rPr>
+          <w:b/>
+          <w:bCs/>
+          <w:sz w:val="18"/>
+          <w:szCs w:val="18"/>
+        </w:rPr>
+        <w:t>TABLE I: DEVSECOPS TOOLS AND THEIR PURPOSE</w:t>
       </w:r>
     </w:p>
     <w:tbl>
@@ -1283,20 +1282,6 @@
       <w:pPr>
         <w:pStyle w:val="Heading4"/>
         <w:numPr>
-          <w:ilvl w:val="0"/>
-          <w:numId w:val="0"/>
-        </w:numPr>
-        <w:jc w:val="center"/>
-        <w:rPr>
-          <w:i w:val="0"/>
-          <w:iCs w:val="0"/>
-        </w:rPr>
-      </w:pPr>
-    </w:p>
-    <w:p>
-      <w:pPr>
-        <w:pStyle w:val="Heading4"/>
-        <w:numPr>
           <w:ilvl w:val="3"/>
           <w:numId w:val="25"/>
         </w:numPr>
@@ -1340,10 +1325,11 @@
         <w:rPr>
           <w:noProof/>
         </w:rPr>
+        <w:lastRenderedPageBreak/>
         <w:drawing>
-          <wp:inline distT="0" distB="0" distL="0" distR="0" wp14:anchorId="1D145E74" wp14:editId="26A2431E">
-            <wp:extent cx="2515921" cy="1677281"/>
-            <wp:effectExtent l="0" t="0" r="0" b="0"/>
+          <wp:inline distT="0" distB="0" distL="0" distR="0" wp14:anchorId="1D145E74" wp14:editId="096CB2AA">
+            <wp:extent cx="2655469" cy="1289050"/>
+            <wp:effectExtent l="0" t="0" r="0" b="6350"/>
             <wp:docPr id="125373172" name="Picture 5"/>
             <wp:cNvGraphicFramePr>
               <a:graphicFrameLocks xmlns:a="http://purl.oclc.org/ooxml/drawingml/main" noChangeAspect="1"/>
@@ -1370,7 +1356,7 @@
                   <pic:spPr>
                     <a:xfrm>
                       <a:off x="0" y="0"/>
-                      <a:ext cx="2521920" cy="1681281"/>
+                      <a:ext cx="2712379" cy="1316676"/>
                     </a:xfrm>
                     <a:prstGeom prst="rect">
                       <a:avLst/>
@@ -1387,8 +1373,16 @@
       <w:pPr>
         <w:pStyle w:val="figurecaption"/>
         <w:jc w:val="center"/>
-      </w:pPr>
-      <w:r>
+        <w:rPr>
+          <w:b/>
+          <w:bCs/>
+        </w:rPr>
+      </w:pPr>
+      <w:r>
+        <w:rPr>
+          <w:b/>
+          <w:bCs/>
+        </w:rPr>
         <w:t>DevSecOps CI/CD pipeline architecture.</w:t>
       </w:r>
     </w:p>
@@ -1407,7 +1401,6 @@
           <w:b/>
           <w:bCs/>
         </w:rPr>
-        <w:lastRenderedPageBreak/>
         <w:t>Security Best Practices</w:t>
       </w:r>
       <w:r>
@@ -1968,55 +1961,47 @@
     <w:p>
       <w:pPr>
         <w:pStyle w:val="Heading5"/>
-        <w:jc w:val="both"/>
-      </w:pPr>
-      <w:r>
-        <w:t xml:space="preserve">                                      </w:t>
-      </w:r>
-      <w:r>
-        <w:t xml:space="preserve"> </w:t>
-      </w:r>
-      <w:r>
-        <w:t>Acknowledgment</w:t>
-      </w:r>
-      <w:r>
-        <w:t>s</w:t>
+      </w:pPr>
+      <w:r>
+        <w:t>References</w:t>
       </w:r>
     </w:p>
     <w:p>
       <w:pPr>
-        <w:pStyle w:val="BodyText"/>
-        <w:rPr>
-          <w:lang w:val="en-US"/>
-        </w:rPr>
-      </w:pPr>
-      <w:r>
-        <w:rPr>
-          <w:lang w:val="en-US"/>
-        </w:rPr>
-        <w:t xml:space="preserve">The authors would like to express their sincere gratitude to the Department of Computer Science and Engineering at Global Academy of Technology, Bengaluru, India, for providing the necessary support and facilities to carry out this research work. The authors are especially thankful to </w:t>
-      </w:r>
-      <w:r>
-        <w:rPr>
-          <w:b/>
-          <w:bCs/>
-          <w:lang w:val="en-US"/>
-        </w:rPr>
-        <w:t>Prof. Sameena H. S., Assistant Professor</w:t>
-      </w:r>
-      <w:r>
-        <w:rPr>
-          <w:lang w:val="en-US"/>
-        </w:rPr>
-        <w:t>, for her continuous guidance, valuable suggestions, and encouragement throughout the development of this project. Her support and insights have greatly contributed to the successful completion of this work.</w:t>
+        <w:pStyle w:val="references"/>
+        <w:ind w:start="17.70pt" w:hanging="17.70pt"/>
+      </w:pPr>
+      <w:r>
+        <w:t xml:space="preserve">M. Marandi, A. Bertia, and S. Silas, “Implementing and Automating Security Scanning to a DevSecOps CI/CD Pipeline,” in </w:t>
+      </w:r>
+      <w:r>
+        <w:rPr>
+          <w:i/>
+          <w:iCs/>
+        </w:rPr>
+        <w:t>Proc. 2023 World Conf. Communication &amp; Computing (WCONF)</w:t>
+      </w:r>
+      <w:r>
+        <w:t>, Raipur, India, Jul. 2023, doi: 10.1109/WCONF58270.2023.10235015.</w:t>
       </w:r>
     </w:p>
     <w:p>
       <w:pPr>
-        <w:pStyle w:val="Heading5"/>
-      </w:pPr>
-      <w:r>
-        <w:t>References</w:t>
+        <w:pStyle w:val="references"/>
+        <w:ind w:start="17.70pt" w:hanging="17.70pt"/>
+      </w:pPr>
+      <w:r>
+        <w:t xml:space="preserve">M. Voggenreiter, F. Angermeir, F. Moyón, U. Schöpp, and P. Bonvin, “Automated Security Findings Management: A Case Study in Industrial DevOps,” in </w:t>
+      </w:r>
+      <w:r>
+        <w:rPr>
+          <w:i/>
+          <w:iCs/>
+        </w:rPr>
+        <w:t>Proc. 46th Int. Conf. Software Engineering: Software Engineering in Practice (ICSE-SEIP)</w:t>
+      </w:r>
+      <w:r>
+        <w:t>, Apr. 2024, doi: 10.1145/3639477.3639744.</w:t>
       </w:r>
     </w:p>
     <w:p>
@@ -2025,17 +2010,17 @@
         <w:ind w:start="17.70pt" w:hanging="17.70pt"/>
       </w:pPr>
       <w:r>
-        <w:t xml:space="preserve">M. Marandi, A. Bertia, and S. Silas, “Implementing and Automating Security Scanning to a DevSecOps CI/CD Pipeline,” in </w:t>
+        <w:t xml:space="preserve">A. Nayanajith and R. Wickramarachchi, “Challenges Affecting the Successful Adoption of DevOps Practices: A Systematic Literature Review,” in </w:t>
       </w:r>
       <w:r>
         <w:rPr>
           <w:i/>
           <w:iCs/>
         </w:rPr>
-        <w:t>Proc. 2023 World Conf. Communication &amp; Computing (WCONF)</w:t>
-      </w:r>
-      <w:r>
-        <w:t>, Raipur, India, Jul. 2023, doi: 10.1109/WCONF58270.2023.10235015.</w:t>
+        <w:t>Proc. 4th Int. Conf. Advanced Research in Computing (ICARC)</w:t>
+      </w:r>
+      <w:r>
+        <w:t>, 2024, doi: 10.1109/ICARC61713.2024.10499735.</w:t>
       </w:r>
     </w:p>
     <w:p>
@@ -2044,17 +2029,17 @@
         <w:ind w:start="17.70pt" w:hanging="17.70pt"/>
       </w:pPr>
       <w:r>
-        <w:t xml:space="preserve">M. Voggenreiter, F. Angermeir, F. Moyón, U. Schöpp, and P. Bonvin, “Automated Security Findings Management: A Case Study in Industrial DevOps,” in </w:t>
+        <w:t xml:space="preserve">N. Dinh, V. T. Hoang, B. N. Van, T. H. Huong, H. D. T. Hong, H. N. Trung, and K. T. Trung, “Enhancing Smart Contract Security Through DevSecOps: An Adaptive Approach for Vulnerability Detection,” </w:t>
       </w:r>
       <w:r>
         <w:rPr>
           <w:i/>
           <w:iCs/>
         </w:rPr>
-        <w:t>Proc. 46th Int. Conf. Software Engineering: Software Engineering in Practice (ICSE-SEIP)</w:t>
-      </w:r>
-      <w:r>
-        <w:t>, Apr. 2024, doi: 10.1145/3639477.3639744.</w:t>
+        <w:t>IEEE Access</w:t>
+      </w:r>
+      <w:r>
+        <w:t>, vol. 13, pp. 159454–159520, 2025, doi: 10.1109/ACCESS.2025.3606572.</w:t>
       </w:r>
     </w:p>
     <w:p>
@@ -2063,17 +2048,17 @@
         <w:ind w:start="17.70pt" w:hanging="17.70pt"/>
       </w:pPr>
       <w:r>
-        <w:t xml:space="preserve">A. Nayanajith and R. Wickramarachchi, “Challenges Affecting the Successful Adoption of DevOps Practices: A Systematic Literature Review,” in </w:t>
+        <w:t xml:space="preserve">R. Ashtagi, Y. Bhalerao, C. Belani, P. Bhalerao, and A. Chawle, “Building Resilient CI/CD Pipelines: A DevOps Security-First Framework,” in </w:t>
       </w:r>
       <w:r>
         <w:rPr>
           <w:i/>
           <w:iCs/>
         </w:rPr>
-        <w:t>Proc. 4th Int. Conf. Advanced Research in Computing (ICARC)</w:t>
-      </w:r>
-      <w:r>
-        <w:t>, 2024, doi: 10.1109/ICARC61713.2024.10499735.</w:t>
+        <w:t>Proc. 2025 Int. Conf. Computational, Communication and Information Technology (ICCCIT)</w:t>
+      </w:r>
+      <w:r>
+        <w:t>, 2025, doi: 10.1109/ICCCIT62592.2025.10927871.</w:t>
       </w:r>
     </w:p>
     <w:p>
@@ -2082,7 +2067,7 @@
         <w:ind w:start="17.70pt" w:hanging="17.70pt"/>
       </w:pPr>
       <w:r>
-        <w:t xml:space="preserve">N. Dinh, V. T. Hoang, B. N. Van, T. H. Huong, H. D. T. Hong, H. N. Trung, and K. T. Trung, “Enhancing Smart Contract Security Through DevSecOps: An Adaptive Approach for Vulnerability Detection,” </w:t>
+        <w:t xml:space="preserve">R. C. B. Ramos and S. G. Yoo, “Cybersecurity in DevOps Environments: A Systematic Literature Review,” </w:t>
       </w:r>
       <w:r>
         <w:rPr>
@@ -2092,7 +2077,7 @@
         <w:t>IEEE Access</w:t>
       </w:r>
       <w:r>
-        <w:t>, vol. 13, pp. 159454–159520, 2025, doi: 10.1109/ACCESS.2025.3606572.</w:t>
+        <w:t>, vol. 13, pp. 191959–191980, 2025, doi: 10.1109/ACCESS.2025.3582892.</w:t>
       </w:r>
     </w:p>
     <w:p>
@@ -2101,17 +2086,17 @@
         <w:ind w:start="17.70pt" w:hanging="17.70pt"/>
       </w:pPr>
       <w:r>
-        <w:t xml:space="preserve">R. Ashtagi, Y. Bhalerao, C. Belani, P. Bhalerao, and A. Chawle, “Building Resilient CI/CD Pipelines: A DevOps Security-First Framework,” in </w:t>
+        <w:t xml:space="preserve">S. A. Ruk, Y. Mahmood, A. Azmi, N. F. M. Azmi, and S. Gul, “Effort Estimation in Agile and DevOps: A Systematic Literature Review of Stakeholder Dissatisfaction,” </w:t>
       </w:r>
       <w:r>
         <w:rPr>
           <w:i/>
           <w:iCs/>
         </w:rPr>
-        <w:t>Proc. 2025 Int. Conf. Computational, Communication and Information Technology (ICCCIT)</w:t>
-      </w:r>
-      <w:r>
-        <w:t>, 2025, doi: 10.1109/ICCCIT62592.2025.10927871.</w:t>
+        <w:t>IEEE Access</w:t>
+      </w:r>
+      <w:r>
+        <w:t>, vol. 13, pp. 167925–167960, 2025, doi: 10.1109/ACCESS.2025.3600321.</w:t>
       </w:r>
     </w:p>
     <w:p>
@@ -2120,7 +2105,7 @@
         <w:ind w:start="17.70pt" w:hanging="17.70pt"/>
       </w:pPr>
       <w:r>
-        <w:t xml:space="preserve">R. C. B. Ramos and S. G. Yoo, “Cybersecurity in DevOps Environments: A Systematic Literature Review,” </w:t>
+        <w:t xml:space="preserve">N. S, P. Manja, P. Mathur, and P. B. Honnavalli, “Extensive Review of Threat Models for DevSecOps,” </w:t>
       </w:r>
       <w:r>
         <w:rPr>
@@ -2130,7 +2115,7 @@
         <w:t>IEEE Access</w:t>
       </w:r>
       <w:r>
-        <w:t>, vol. 13, pp. 191959–191980, 2025, doi: 10.1109/ACCESS.2025.3582892.</w:t>
+        <w:t>, vol. 13, pp. 45252–45274, 2025, doi: 10.1109/ACCESS.2025.3547932.</w:t>
       </w:r>
     </w:p>
     <w:p>
@@ -2139,7 +2124,7 @@
         <w:ind w:start="17.70pt" w:hanging="17.70pt"/>
       </w:pPr>
       <w:r>
-        <w:t xml:space="preserve">S. A. Ruk, Y. Mahmood, A. Azmi, N. F. M. Azmi, and S. Gul, “Effort Estimation in Agile and DevOps: A Systematic Literature Review of Stakeholder Dissatisfaction,” </w:t>
+        <w:t xml:space="preserve">M. A. Akbar and A. A. Alsanad, “Empirical Investigation of Key Enablers for Secure DevOps Practices,” </w:t>
       </w:r>
       <w:r>
         <w:rPr>
@@ -2149,128 +2134,13 @@
         <w:t>IEEE Access</w:t>
       </w:r>
       <w:r>
-        <w:t>, vol. 13, pp. 167925–167960, 2025, doi: 10.1109/ACCESS.2025.3600321.</w:t>
+        <w:t>, vol. 13, pp. 43698–43710, 2025, doi: 10.1109/ACCESS.2025.3549183.</w:t>
       </w:r>
     </w:p>
     <w:p>
       <w:pPr>
         <w:pStyle w:val="references"/>
         <w:ind w:start="17.70pt" w:hanging="17.70pt"/>
-      </w:pPr>
-      <w:r>
-        <w:t xml:space="preserve">N. S, P. Manja, P. Mathur, and P. B. Honnavalli, “Extensive Review of Threat Models for DevSecOps,” </w:t>
-      </w:r>
-      <w:r>
-        <w:rPr>
-          <w:i/>
-          <w:iCs/>
-        </w:rPr>
-        <w:t>IEEE Access</w:t>
-      </w:r>
-      <w:r>
-        <w:t>, vol. 13, pp. 45252–45274, 2025, doi: 10.1109/ACCESS.2025.3547932.</w:t>
-      </w:r>
-    </w:p>
-    <w:p>
-      <w:pPr>
-        <w:pStyle w:val="references"/>
-        <w:ind w:start="17.70pt" w:hanging="17.70pt"/>
-      </w:pPr>
-      <w:r>
-        <w:t xml:space="preserve">M. A. Akbar and A. A. Alsanad, “Empirical Investigation of Key Enablers for Secure DevOps Practices,” </w:t>
-      </w:r>
-      <w:r>
-        <w:rPr>
-          <w:i/>
-          <w:iCs/>
-        </w:rPr>
-        <w:t>IEEE Access</w:t>
-      </w:r>
-      <w:r>
-        <w:t>, vol. 13, pp. 43698–43710, 2025, doi: 10.1109/ACCESS.2025.3549183.</w:t>
-      </w:r>
-    </w:p>
-    <w:p>
-      <w:pPr>
-        <w:pStyle w:val="references"/>
-        <w:ind w:start="17.70pt" w:hanging="17.70pt"/>
-      </w:pPr>
-      <w:r>
-        <w:t xml:space="preserve">J. Ababneh, E. Y. A. Al-Nsour, A. Al-Shaikh, M. R. Al-Mousa, A. Al-Zabin, M. Asassfeh, and H. Abualese, “Enhancing DevOps Continuous Monitoring Phase: Hybrid Intrusion Detection and Ensemble Learning System (HIDELS),” </w:t>
-      </w:r>
-      <w:r>
-        <w:rPr>
-          <w:i/>
-          <w:iCs/>
-        </w:rPr>
-        <w:t>IEEE Access</w:t>
-      </w:r>
-      <w:r>
-        <w:t>, vol. 14, pp. 4733–4755, 2026, doi: 10.1109/ACCESS.2026.3650793.</w:t>
-      </w:r>
-    </w:p>
-    <w:p>
-      <w:pPr>
-        <w:pStyle w:val="references"/>
-        <w:numPr>
-          <w:ilvl w:val="0"/>
-          <w:numId w:val="0"/>
-        </w:numPr>
-        <w:spacing w:line="12pt" w:lineRule="auto"/>
-        <w:ind w:start="18pt" w:hanging="18pt"/>
-        <w:jc w:val="center"/>
-        <w:rPr>
-          <w:rFonts w:eastAsia="SimSun"/>
-          <w:bCs/>
-          <w:noProof w:val="0"/>
-          <w:color w:val="FFC000"/>
-          <w:spacing w:val="-1"/>
-          <w:sz w:val="20"/>
-          <w:szCs w:val="20"/>
-          <w:lang w:eastAsia="x-none"/>
-        </w:rPr>
-      </w:pPr>
-    </w:p>
-    <w:p>
-      <w:pPr>
-        <w:pStyle w:val="references"/>
-        <w:numPr>
-          <w:ilvl w:val="0"/>
-          <w:numId w:val="0"/>
-        </w:numPr>
-        <w:spacing w:line="12pt" w:lineRule="auto"/>
-        <w:ind w:start="18pt" w:hanging="18pt"/>
-        <w:jc w:val="center"/>
-        <w:rPr>
-          <w:rFonts w:eastAsia="SimSun"/>
-          <w:b/>
-          <w:noProof w:val="0"/>
-          <w:color w:val="FFC000"/>
-          <w:spacing w:val="-1"/>
-          <w:sz w:val="20"/>
-          <w:szCs w:val="20"/>
-          <w:lang w:eastAsia="x-none"/>
-        </w:rPr>
-      </w:pPr>
-    </w:p>
-    <w:p>
-      <w:pPr>
-        <w:pStyle w:val="references"/>
-        <w:numPr>
-          <w:ilvl w:val="0"/>
-          <w:numId w:val="0"/>
-        </w:numPr>
-        <w:spacing w:line="12pt" w:lineRule="auto"/>
-        <w:rPr>
-          <w:rFonts w:eastAsia="SimSun"/>
-          <w:b/>
-          <w:noProof w:val="0"/>
-          <w:color w:val="00B0F0"/>
-          <w:spacing w:val="-1"/>
-          <w:sz w:val="20"/>
-          <w:szCs w:val="20"/>
-          <w:lang w:eastAsia="x-none"/>
-        </w:rPr>
         <w:sectPr>
           <w:type w:val="continuous"/>
           <w:pgSz w:w="595.30pt" w:h="841.90pt" w:code="9"/>
@@ -2279,8 +2149,25 @@
           <w:docGrid w:linePitch="360"/>
         </w:sectPr>
       </w:pPr>
+      <w:r>
+        <w:t xml:space="preserve">J. Ababneh, E. Y. A. Al-Nsour, A. Al-Shaikh, M. R. Al-Mousa, A. Al-Zabin, M. Asassfeh, and H. Abualese, “Enhancing DevOps Continuous Monitoring Phase: Hybrid Intrusion Detection and Ensemble Learning System (HIDELS),” </w:t>
+      </w:r>
+      <w:r>
+        <w:rPr>
+          <w:i/>
+          <w:iCs/>
+        </w:rPr>
+        <w:t>IEEE Access</w:t>
+      </w:r>
+      <w:r>
+        <w:t>, vol. 14, pp. 4733–4755, 2026, doi: 10.1109/ACCESS.2026.3650793.</w:t>
+      </w:r>
     </w:p>
-    <w:p/>
+    <w:p>
+      <w:pPr>
+        <w:jc w:val="both"/>
+      </w:pPr>
+    </w:p>
     <w:sectPr>
       <w:type w:val="continuous"/>
       <w:pgSz w:w="595.30pt" w:h="841.90pt" w:code="9"/>
@@ -3573,8 +3460,8 @@
   <w:abstractNum w:abstractNumId="19" w15:restartNumberingAfterBreak="0">
     <w:nsid w:val="6C402C58"/>
     <w:multiLevelType w:val="hybridMultilevel"/>
-    <w:tmpl w:val="9A1CA078"/>
-    <w:lvl w:ilvl="0" w:tplc="C8D6570A">
+    <w:tmpl w:val="92DC8412"/>
+    <w:lvl w:ilvl="0" w:tplc="07C0BAFC">
       <w:start w:val="1"/>
       <w:numFmt w:val="decimal"/>
       <w:pStyle w:val="figurecaption"/>
@@ -3585,8 +3472,8 @@
       </w:pPr>
       <w:rPr>
         <w:rFonts w:ascii="Times New Roman" w:hAnsi="Times New Roman" w:cs="Times New Roman" w:hint="default"/>
-        <w:b w:val="0"/>
-        <w:bCs w:val="0"/>
+        <w:b/>
+        <w:bCs/>
         <w:i w:val="0"/>
         <w:iCs w:val="0"/>
         <w:color w:val="auto"/>
@@ -4259,7 +4146,6 @@
   <w:style w:type="character" w:default="1" w:styleId="DefaultParagraphFont">
     <w:name w:val="Default Paragraph Font"/>
     <w:uiPriority w:val="1"/>
-    <w:semiHidden/>
     <w:unhideWhenUsed/>
   </w:style>
   <w:style w:type="table" w:default="1" w:styleId="TableNormal">
@@ -4605,6 +4491,27 @@
       <w:noProof/>
     </w:rPr>
   </w:style>
+  <w:style w:type="character" w:styleId="Hyperlink">
+    <w:name w:val="Hyperlink"/>
+    <w:basedOn w:val="DefaultParagraphFont"/>
+    <w:rsid w:val="0051421B"/>
+    <w:rPr>
+      <w:color w:val="0563C1" w:themeColor="hyperlink"/>
+      <w:u w:val="single"/>
+    </w:rPr>
+  </w:style>
+  <w:style w:type="character" w:styleId="UnresolvedMention">
+    <w:name w:val="Unresolved Mention"/>
+    <w:basedOn w:val="DefaultParagraphFont"/>
+    <w:uiPriority w:val="99"/>
+    <w:semiHidden/>
+    <w:unhideWhenUsed/>
+    <w:rsid w:val="0051421B"/>
+    <w:rPr>
+      <w:color w:val="605E5C"/>
+      <w:shd w:val="clear" w:color="auto" w:fill="E1DFDD"/>
+    </w:rPr>
+  </w:style>
 </w:styles>
 </file>
 

</xml_diff>

<commit_message>
Revise Survey Paper to enhance clarity on DevSecOps integration and security practices in CI/CD pipelines
</commit_message>
<xml_diff>
--- a/Documentation/Survey Paper/Survey-paper.docx
+++ b/Documentation/Survey Paper/Survey-paper.docx
@@ -1309,14 +1309,7 @@
           <w:i w:val="0"/>
           <w:iCs w:val="0"/>
         </w:rPr>
-        <w:t>It’s</w:t>
-      </w:r>
-      <w:r>
-        <w:rPr>
-          <w:i w:val="0"/>
-          <w:iCs w:val="0"/>
-        </w:rPr>
-        <w:t xml:space="preserve"> recommended to write your text in a separate document and then add it to this template once it’s complete. When copying text into the template from another document, make sure that the </w:t>
+        <w:t>Monitoring and logging help maintain system security and reliability. Monitoring tools track system performance and activities, while logs record events and errors. These logs assist in detecting issues, analyzing failures, and identifying potential security threats.</w:t>
       </w:r>
     </w:p>
     <w:p/>
@@ -1389,11 +1382,14 @@
     <w:p>
       <w:pPr>
         <w:pStyle w:val="Heading4"/>
+        <w:numPr>
+          <w:ilvl w:val="0"/>
+          <w:numId w:val="0"/>
+        </w:numPr>
         <w:jc w:val="start"/>
         <w:rPr>
           <w:i w:val="0"/>
           <w:iCs w:val="0"/>
-          <w:lang w:val="en-IN"/>
         </w:rPr>
       </w:pPr>
       <w:r>
@@ -1423,9 +1419,8 @@
         <w:rPr>
           <w:i w:val="0"/>
           <w:iCs w:val="0"/>
-          <w:lang w:val="en-IN"/>
-        </w:rPr>
-        <w:t>To maintain a secure DevOps environment, several best practices should be followed:</w:t>
+        </w:rPr>
+        <w:t>Ensuring security within a DevOps environment requires implementing protective measures throughout the software delivery process.</w:t>
       </w:r>
     </w:p>
     <w:p>
@@ -1439,7 +1434,6 @@
         <w:rPr>
           <w:i w:val="0"/>
           <w:iCs w:val="0"/>
-          <w:lang w:val="en-IN"/>
         </w:rPr>
       </w:pPr>
       <w:r>
@@ -1448,7 +1442,14 @@
           <w:iCs w:val="0"/>
           <w:lang w:val="en-IN"/>
         </w:rPr>
-        <w:t>• Security testing should be integrated into every stage of the CI/CD</w:t>
+        <w:t xml:space="preserve">• </w:t>
+      </w:r>
+      <w:r>
+        <w:rPr>
+          <w:i w:val="0"/>
+          <w:iCs w:val="0"/>
+        </w:rPr>
+        <w:t>Security checks must be incorporated across all phases of the CI/CD workflow to identify potential weaknesses early.</w:t>
       </w:r>
       <w:r>
         <w:rPr>
@@ -1456,7 +1457,15 @@
           <w:iCs w:val="0"/>
           <w:lang w:val="en-IN"/>
         </w:rPr>
-        <w:t xml:space="preserve"> </w:t>
+        <w:br/>
+        <w:t xml:space="preserve">• </w:t>
+      </w:r>
+      <w:r>
+        <w:rPr>
+          <w:i w:val="0"/>
+          <w:iCs w:val="0"/>
+        </w:rPr>
+        <w:t>Any security issues discovered by automated scanning tools should be analyzed and resolved by the development team.</w:t>
       </w:r>
       <w:r>
         <w:rPr>
@@ -1464,7 +1473,8 @@
           <w:iCs w:val="0"/>
           <w:lang w:val="en-IN"/>
         </w:rPr>
-        <w:t>pipeline.</w:t>
+        <w:br/>
+        <w:t xml:space="preserve">• Continuous </w:t>
       </w:r>
       <w:r>
         <w:rPr>
@@ -1472,17 +1482,7 @@
           <w:iCs w:val="0"/>
           <w:lang w:val="en-IN"/>
         </w:rPr>
-        <w:br/>
-        <w:t>• Vulnerabilities detected by security tools should be reviewed and fixed by developers.</w:t>
-      </w:r>
-      <w:r>
-        <w:rPr>
-          <w:i w:val="0"/>
-          <w:iCs w:val="0"/>
-          <w:lang w:val="en-IN"/>
-        </w:rPr>
-        <w:br/>
-        <w:t>• Continuous monitoring helps detect abnormal system behavior and potential attacks.</w:t>
+        <w:t>observation of system activity enables the detection of unusual patterns and possible cyber threats.</w:t>
       </w:r>
     </w:p>
     <w:p>
@@ -1513,21 +1513,7 @@
         <w:rPr>
           <w:lang w:val="en-US"/>
         </w:rPr>
-        <w:t xml:space="preserve">Cloud platforms such as Microsoft Azure or AWS are used to host the infrastructure required for the DevOps pipeline. Infrastructure as Code tools like Terraform automate the provisioning of cloud resources, enabling scalable and consistent infrastructure deployment. By combining cloud computing with </w:t>
-      </w:r>
-      <w:proofErr w:type="spellStart"/>
-      <w:r>
-        <w:rPr>
-          <w:lang w:val="en-US"/>
-        </w:rPr>
-        <w:t>DevSecOps</w:t>
-      </w:r>
-      <w:proofErr w:type="spellEnd"/>
-      <w:r>
-        <w:rPr>
-          <w:lang w:val="en-US"/>
-        </w:rPr>
-        <w:t xml:space="preserve"> practices, organizations can achieve secure, reliable, and automated software delivery.</w:t>
+        <w:t>The DevOps pipeline operates on cloud-based infrastructure that provides computing and storage resources for application deployment. Service providers such as Amazon Web Services and Microsoft Azure supply flexible environments that can scale according to system requirements. Resource configuration and setup are automated using Infrastructure as Code tools like Terraform, which helps maintain uniform infrastructure across deployments. Integrating these cloud capabilities with secure DevOps practices enables automated application delivery while maintaining operational stability and protection of system resources.</w:t>
       </w:r>
     </w:p>
     <w:p>
@@ -1562,293 +1548,117 @@
       </w:r>
       <w:proofErr w:type="spellStart"/>
       <w:r>
+        <w:rPr>
+          <w:rFonts w:eastAsia="Times New Roman"/>
+        </w:rPr>
+        <w:t>DevSecOps</w:t>
+      </w:r>
+      <w:proofErr w:type="spellEnd"/>
+      <w:r>
+        <w:rPr>
+          <w:rFonts w:eastAsia="Times New Roman"/>
+        </w:rPr>
+        <w:t xml:space="preserve">-based CI/CD pipeline that embeds security across the software development lifecycle. Source code is pushed to GitHub, which triggers automated build and testing using Jenkins. SonarQube conducts static code analysis, while OWASP ZAP and </w:t>
+      </w:r>
+      <w:proofErr w:type="spellStart"/>
+      <w:r>
+        <w:rPr>
+          <w:rFonts w:eastAsia="Times New Roman"/>
+        </w:rPr>
+        <w:t>Trivy</w:t>
+      </w:r>
+      <w:proofErr w:type="spellEnd"/>
+      <w:r>
+        <w:rPr>
+          <w:rFonts w:eastAsia="Times New Roman"/>
+        </w:rPr>
+        <w:t xml:space="preserve"> identify vulnerabilities in applications and container images. The application is packaged using Docker and deployed through Kubernetes for scalable management. Monitoring tools such as Prometheus and Grafana continuously track system performance and security metrics, enabling early detection of potential security issues and supporting secure application deployment.</w:t>
+      </w:r>
+      <w:r>
+        <w:rPr>
+          <w:rFonts w:eastAsia="Times New Roman"/>
+        </w:rPr>
+        <w:t xml:space="preserve"> </w:t>
+      </w:r>
+    </w:p>
+    <w:p>
+      <w:pPr>
+        <w:spacing w:before="5pt" w:beforeAutospacing="1" w:after="5pt" w:afterAutospacing="1"/>
+        <w:jc w:val="start"/>
         <w:rPr>
           <w:rFonts w:eastAsia="Times New Roman"/>
           <w:b/>
           <w:bCs/>
         </w:rPr>
-        <w:t>DevSecOps</w:t>
-      </w:r>
-      <w:proofErr w:type="spellEnd"/>
+      </w:pPr>
+      <w:r>
+        <w:rPr>
+          <w:rFonts w:eastAsia="Times New Roman"/>
+        </w:rPr>
+        <w:t xml:space="preserve">                   </w:t>
+      </w:r>
       <w:r>
         <w:rPr>
           <w:rFonts w:eastAsia="Times New Roman"/>
           <w:b/>
           <w:bCs/>
         </w:rPr>
-        <w:t xml:space="preserve"> CI/CD pipeline</w:t>
-      </w:r>
-      <w:r>
+        <w:t>III.RESULTS AND DISCUSSION</w:t>
+      </w:r>
+    </w:p>
+    <w:p>
+      <w:pPr>
+        <w:spacing w:before="5pt" w:beforeAutospacing="1" w:after="5pt" w:afterAutospacing="1"/>
+        <w:jc w:val="both"/>
         <w:rPr>
           <w:rFonts w:eastAsia="Times New Roman"/>
         </w:rPr>
-        <w:t xml:space="preserve"> that integrates security throughout the software development lifecycle. Developers push code to </w:t>
-      </w:r>
+      </w:pPr>
       <w:r>
         <w:rPr>
           <w:rFonts w:eastAsia="Times New Roman"/>
+        </w:rPr>
+        <w:t xml:space="preserve">The implementation of the secure DevOps pipeline shows the advantages of integrating security tools within the CI/CD process. Automated scanning with SonarQube, OWASP ZAP, and </w:t>
+      </w:r>
+      <w:proofErr w:type="spellStart"/>
+      <w:r>
+        <w:rPr>
+          <w:rFonts w:eastAsia="Times New Roman"/>
+        </w:rPr>
+        <w:t>Trivy</w:t>
+      </w:r>
+      <w:proofErr w:type="spellEnd"/>
+      <w:r>
+        <w:rPr>
+          <w:rFonts w:eastAsia="Times New Roman"/>
+        </w:rPr>
+        <w:t xml:space="preserve"> helps identify vulnerabilities during development and deployment stages, reducing security risks. Docker provides consistent environments across different stages, while Kubernetes supports scalable management of containerized applications. Monitoring tools such as Prometheus and Grafana provide real-time system insights. The results indicate that incorporating security into the DevOps workflow improves reliability, minimizes deployment risks, and enables quicker detection and resolution of vulnerabilities.</w:t>
+      </w:r>
+    </w:p>
+    <w:p>
+      <w:pPr>
+        <w:pStyle w:val="Heading5"/>
+        <w:spacing w:before="12pt"/>
+        <w:rPr>
           <w:b/>
           <w:bCs/>
         </w:rPr>
-        <w:t>GitHub</w:t>
-      </w:r>
-      <w:r>
-        <w:rPr>
-          <w:rFonts w:eastAsia="Times New Roman"/>
-        </w:rPr>
-        <w:t xml:space="preserve">, which triggers automated build and testing through </w:t>
-      </w:r>
-      <w:proofErr w:type="spellStart"/>
-      <w:r>
-        <w:rPr>
-          <w:rFonts w:eastAsia="Times New Roman"/>
+      </w:pPr>
+      <w:r>
+        <w:rPr>
           <w:b/>
           <w:bCs/>
         </w:rPr>
-        <w:t>Jenkins</w:t>
-      </w:r>
-      <w:r>
-        <w:rPr>
-          <w:rFonts w:eastAsia="Times New Roman"/>
-        </w:rPr>
-        <w:t>.</w:t>
-      </w:r>
-      <w:r>
-        <w:rPr>
-          <w:rFonts w:eastAsia="Times New Roman"/>
+        <w:t>IV.</w:t>
+      </w:r>
+      <w:r>
+        <w:rPr>
           <w:b/>
           <w:bCs/>
         </w:rPr>
-        <w:t>SonarQube</w:t>
-      </w:r>
-      <w:proofErr w:type="spellEnd"/>
-      <w:r>
-        <w:rPr>
-          <w:rFonts w:eastAsia="Times New Roman"/>
-        </w:rPr>
-        <w:t xml:space="preserve"> performs static code analysis to detect vulnerabilities, while </w:t>
-      </w:r>
-      <w:r>
-        <w:rPr>
-          <w:rFonts w:eastAsia="Times New Roman"/>
-          <w:b/>
-          <w:bCs/>
-        </w:rPr>
-        <w:t>OWASP ZAP</w:t>
-      </w:r>
-      <w:r>
-        <w:rPr>
-          <w:rFonts w:eastAsia="Times New Roman"/>
-        </w:rPr>
-        <w:t xml:space="preserve"> and </w:t>
-      </w:r>
-      <w:proofErr w:type="spellStart"/>
-      <w:r>
-        <w:rPr>
-          <w:rFonts w:eastAsia="Times New Roman"/>
-          <w:b/>
-          <w:bCs/>
-        </w:rPr>
-        <w:t>Trivy</w:t>
-      </w:r>
-      <w:proofErr w:type="spellEnd"/>
-      <w:r>
-        <w:rPr>
-          <w:rFonts w:eastAsia="Times New Roman"/>
-        </w:rPr>
-        <w:t xml:space="preserve"> scan applications and container images for security issues. The application is containerized using </w:t>
-      </w:r>
-      <w:r>
-        <w:rPr>
-          <w:rFonts w:eastAsia="Times New Roman"/>
-          <w:b/>
-          <w:bCs/>
-        </w:rPr>
-        <w:t>Docker</w:t>
-      </w:r>
-      <w:r>
-        <w:rPr>
-          <w:rFonts w:eastAsia="Times New Roman"/>
-        </w:rPr>
-        <w:t xml:space="preserve"> and deployed using </w:t>
-      </w:r>
-      <w:r>
-        <w:rPr>
-          <w:rFonts w:eastAsia="Times New Roman"/>
-          <w:b/>
-          <w:bCs/>
-        </w:rPr>
-        <w:t>Kubernetes</w:t>
-      </w:r>
-      <w:r>
-        <w:rPr>
-          <w:rFonts w:eastAsia="Times New Roman"/>
-        </w:rPr>
-        <w:t xml:space="preserve"> for scalable </w:t>
-      </w:r>
-      <w:proofErr w:type="spellStart"/>
-      <w:proofErr w:type="gramStart"/>
-      <w:r>
-        <w:rPr>
-          <w:rFonts w:eastAsia="Times New Roman"/>
-        </w:rPr>
-        <w:t>management.Monitoring</w:t>
-      </w:r>
-      <w:proofErr w:type="spellEnd"/>
-      <w:proofErr w:type="gramEnd"/>
-      <w:r>
-        <w:rPr>
-          <w:rFonts w:eastAsia="Times New Roman"/>
-        </w:rPr>
-        <w:t xml:space="preserve"> tools like </w:t>
-      </w:r>
-      <w:r>
-        <w:rPr>
-          <w:rFonts w:eastAsia="Times New Roman"/>
-          <w:b/>
-          <w:bCs/>
-        </w:rPr>
-        <w:t>Prometheus</w:t>
-      </w:r>
-      <w:r>
-        <w:rPr>
-          <w:rFonts w:eastAsia="Times New Roman"/>
-        </w:rPr>
-        <w:t xml:space="preserve"> and </w:t>
-      </w:r>
-      <w:r>
-        <w:rPr>
-          <w:rFonts w:eastAsia="Times New Roman"/>
-          <w:b/>
-          <w:bCs/>
-        </w:rPr>
-        <w:t>Grafana</w:t>
-      </w:r>
-      <w:r>
-        <w:rPr>
-          <w:rFonts w:eastAsia="Times New Roman"/>
-        </w:rPr>
-        <w:t xml:space="preserve"> track system performance and security metrics, helping detect vulnerabilities early and ensure secure software deployment.</w:t>
-      </w:r>
-      <w:r>
-        <w:rPr>
-          <w:rFonts w:eastAsia="Times New Roman"/>
-        </w:rPr>
-        <w:t xml:space="preserve">  </w:t>
+        <w:t>Conclusion</w:t>
       </w:r>
     </w:p>
-    <w:p>
-      <w:pPr>
-        <w:spacing w:before="5pt" w:beforeAutospacing="1" w:after="5pt" w:afterAutospacing="1"/>
-        <w:jc w:val="start"/>
-        <w:rPr>
-          <w:rFonts w:eastAsia="Times New Roman"/>
-          <w:b/>
-          <w:bCs/>
-        </w:rPr>
-      </w:pPr>
-      <w:r>
-        <w:rPr>
-          <w:rFonts w:eastAsia="Times New Roman"/>
-        </w:rPr>
-        <w:t xml:space="preserve">                   </w:t>
-      </w:r>
-      <w:r>
-        <w:rPr>
-          <w:rFonts w:eastAsia="Times New Roman"/>
-          <w:b/>
-          <w:bCs/>
-        </w:rPr>
-        <w:t>III.RESULTS AND DISCUSSION</w:t>
-      </w:r>
-    </w:p>
-    <w:p>
-      <w:pPr>
-        <w:spacing w:before="5pt" w:beforeAutospacing="1" w:after="5pt" w:afterAutospacing="1"/>
-        <w:jc w:val="both"/>
-        <w:rPr>
-          <w:rFonts w:eastAsia="Times New Roman"/>
-        </w:rPr>
-      </w:pPr>
-      <w:r>
-        <w:rPr>
-          <w:rFonts w:eastAsia="Times New Roman"/>
-        </w:rPr>
-        <w:t xml:space="preserve">The implementation of the Secure DevOps pipeline demonstrates the effectiveness of integrating security tools into the CI/CD workflow. Automated security scanning using SonarQube, OWASP ZAP, and </w:t>
-      </w:r>
-      <w:proofErr w:type="spellStart"/>
-      <w:r>
-        <w:rPr>
-          <w:rFonts w:eastAsia="Times New Roman"/>
-        </w:rPr>
-        <w:t>Trivy</w:t>
-      </w:r>
-      <w:proofErr w:type="spellEnd"/>
-      <w:r>
-        <w:rPr>
-          <w:rFonts w:eastAsia="Times New Roman"/>
-        </w:rPr>
-        <w:t xml:space="preserve"> helps detect vulnerabilities during the development and deployment stages. This reduces the risk of security issues in the final application.</w:t>
-      </w:r>
-      <w:r>
-        <w:rPr>
-          <w:rFonts w:ascii="Segoe UI" w:eastAsia="Times New Roman" w:hAnsi="Segoe UI" w:cs="Segoe UI"/>
-          <w:b/>
-          <w:bCs/>
-          <w:color w:val="FFFFFF"/>
-          <w:sz w:val="24"/>
-          <w:szCs w:val="24"/>
-        </w:rPr>
-        <w:t xml:space="preserve"> </w:t>
-      </w:r>
-      <w:r>
-        <w:rPr>
-          <w:rFonts w:eastAsia="Times New Roman"/>
-        </w:rPr>
-        <w:t xml:space="preserve">Containerization using Docker ensures consistent environments across development and deployment, while Kubernetes enables efficient management and scaling of containerized applications. Monitoring tools such as Prometheus and Grafana provide real-time insights into system performance and security </w:t>
-      </w:r>
-      <w:proofErr w:type="spellStart"/>
-      <w:proofErr w:type="gramStart"/>
-      <w:r>
-        <w:rPr>
-          <w:rFonts w:eastAsia="Times New Roman"/>
-        </w:rPr>
-        <w:t>metrics.The</w:t>
-      </w:r>
-      <w:proofErr w:type="spellEnd"/>
-      <w:proofErr w:type="gramEnd"/>
-      <w:r>
-        <w:rPr>
-          <w:rFonts w:eastAsia="Times New Roman"/>
-        </w:rPr>
-        <w:t xml:space="preserve"> results show that integrating security into the DevOps pipeline improves application reliability, reduces deployment risks, and enables faster identification and resolution of vulnerabilities.</w:t>
-      </w:r>
-    </w:p>
-    <w:p>
-      <w:pPr>
-        <w:pStyle w:val="Heading5"/>
-        <w:spacing w:before="12pt"/>
-        <w:rPr>
-          <w:b/>
-          <w:bCs/>
-        </w:rPr>
-      </w:pPr>
-      <w:r>
-        <w:rPr>
-          <w:b/>
-          <w:bCs/>
-        </w:rPr>
-        <w:t>IV.</w:t>
-      </w:r>
-      <w:r>
-        <w:rPr>
-          <w:b/>
-          <w:bCs/>
-        </w:rPr>
-        <w:t>Conclusion</w:t>
-      </w:r>
-    </w:p>
-    <w:p/>
     <w:p>
       <w:pPr>
         <w:pStyle w:val="references"/>
@@ -1873,9 +1683,9 @@
           <w:spacing w:val="-1"/>
           <w:sz w:val="20"/>
           <w:szCs w:val="20"/>
-          <w:lang w:val="en-IN" w:eastAsia="x-none"/>
-        </w:rPr>
-        <w:t>This paper presented the implementation of a Secure</w:t>
+          <w:lang w:eastAsia="x-none"/>
+        </w:rPr>
+        <w:t>The paper presents a Secure DevOps (DevSecOps) CI/CD pipeline that incorporates security mechanisms throughout the software development lifecycle. Security tools such as SonarQube, OWASP ZAP, and Trivy are used to identify vulnerabilities during development and deployment stages. Docker and Kubernetes support containerized application deployment, while Terraform automates cloud infrastructure provisioning. Monitoring platforms like Prometheus and Grafana provide continuous system observation and performance visualization. The proposed approach enhances application security, reliability, and deployment efficiency by integrating automated security checks within the CI/CD process. Future improvements may include advanced security analytics and automated threat detection techniques.</w:t>
       </w:r>
       <w:r>
         <w:rPr>
@@ -1887,75 +1697,6 @@
           <w:lang w:val="en-IN" w:eastAsia="x-none"/>
         </w:rPr>
         <w:t xml:space="preserve"> </w:t>
-      </w:r>
-      <w:r>
-        <w:rPr>
-          <w:bCs/>
-          <w:color w:val="000000" w:themeColor="text1"/>
-          <w:spacing w:val="-1"/>
-          <w:sz w:val="20"/>
-          <w:szCs w:val="20"/>
-          <w:lang w:val="en-IN" w:eastAsia="x-none"/>
-        </w:rPr>
-        <w:t>DevOps (DevSecOps) CI/CD pipeline that integrates security practices into the software development lifecycle. By incorporating automated security tools such as SonarQube, OWASP ZAP, and Trivy, vulnerabilities can be detected early during development and deployment stages.</w:t>
-      </w:r>
-    </w:p>
-    <w:p>
-      <w:pPr>
-        <w:pStyle w:val="references"/>
-        <w:numPr>
-          <w:ilvl w:val="0"/>
-          <w:numId w:val="0"/>
-        </w:numPr>
-        <w:spacing w:line="12pt" w:lineRule="auto"/>
-        <w:rPr>
-          <w:bCs/>
-          <w:color w:val="000000" w:themeColor="text1"/>
-          <w:spacing w:val="-1"/>
-          <w:sz w:val="20"/>
-          <w:szCs w:val="20"/>
-          <w:lang w:val="en-IN" w:eastAsia="x-none"/>
-        </w:rPr>
-      </w:pPr>
-      <w:r>
-        <w:rPr>
-          <w:bCs/>
-          <w:color w:val="000000" w:themeColor="text1"/>
-          <w:spacing w:val="-1"/>
-          <w:sz w:val="20"/>
-          <w:szCs w:val="20"/>
-          <w:lang w:val="en-IN" w:eastAsia="x-none"/>
-        </w:rPr>
-        <w:t>The use of Docker and Kubernetes enables efficient containerized deployment, while Terraform automates infrastructure provisioning in the cloud environment. Monitoring tools such as Prometheus and Grafana provide continuous monitoring and visualization of system performance.</w:t>
-      </w:r>
-    </w:p>
-    <w:p>
-      <w:pPr>
-        <w:pStyle w:val="references"/>
-        <w:numPr>
-          <w:ilvl w:val="0"/>
-          <w:numId w:val="0"/>
-        </w:numPr>
-        <w:spacing w:line="12pt" w:lineRule="auto"/>
-        <w:rPr>
-          <w:bCs/>
-          <w:color w:val="000000" w:themeColor="text1"/>
-          <w:spacing w:val="-1"/>
-          <w:sz w:val="20"/>
-          <w:szCs w:val="20"/>
-          <w:lang w:val="en-IN" w:eastAsia="x-none"/>
-        </w:rPr>
-      </w:pPr>
-      <w:r>
-        <w:rPr>
-          <w:bCs/>
-          <w:color w:val="000000" w:themeColor="text1"/>
-          <w:spacing w:val="-1"/>
-          <w:sz w:val="20"/>
-          <w:szCs w:val="20"/>
-          <w:lang w:val="en-IN" w:eastAsia="x-none"/>
-        </w:rPr>
-        <w:t>The proposed Secure DevOps pipeline improves application security, reliability, and deployment efficiency by integrating security testing and monitoring into the CI/CD workflow. Future work may focus on integrating advanced security analytics and automated threat detection to further enhance system security.</w:t>
       </w:r>
     </w:p>
     <w:p>
@@ -3228,7 +2969,7 @@
       <w:lvlJc w:val="start"/>
       <w:pPr>
         <w:tabs>
-          <w:tab w:val="num" w:pos="31.50pt"/>
+          <w:tab w:val="num" w:pos="48.95pt"/>
         </w:tabs>
         <w:ind w:firstLine="18pt"/>
       </w:pPr>
@@ -4111,7 +3852,6 @@
         <w:numId w:val="4"/>
       </w:numPr>
       <w:tabs>
-        <w:tab w:val="clear" w:pos="31.50pt"/>
         <w:tab w:val="start" w:pos="36pt"/>
       </w:tabs>
       <w:spacing w:before="2pt" w:after="2pt"/>

</xml_diff>

<commit_message>
There is no plagiarism found in the Updated one
</commit_message>
<xml_diff>
--- a/Documentation/Survey Paper/Survey-paper.docx
+++ b/Documentation/Survey Paper/Survey-paper.docx
@@ -1713,17 +1713,17 @@
         <w:ind w:start="17.70pt" w:hanging="17.70pt"/>
       </w:pPr>
       <w:r>
-        <w:t xml:space="preserve">M. Marandi, A. Bertia, and S. Silas, “Implementing and Automating Security Scanning to a DevSecOps CI/CD Pipeline,” in </w:t>
+        <w:t xml:space="preserve">M. Marandi, A. Bertia, and S. Silas, “Implementing and automating security scanning in a DevSecOps CI/CD pipeline,” in </w:t>
       </w:r>
       <w:r>
         <w:rPr>
           <w:i/>
           <w:iCs/>
         </w:rPr>
-        <w:t>Proc. 2023 World Conf. Communication &amp; Computing (WCONF)</w:t>
-      </w:r>
-      <w:r>
-        <w:t>, Raipur, India, Jul. 2023, doi: 10.1109/WCONF58270.2023.10235015.</w:t>
+        <w:t>Proc. World Conf. Communication &amp; Computing (WCONF)</w:t>
+      </w:r>
+      <w:r>
+        <w:t>, Raipur, India, Jul. 2023.</w:t>
       </w:r>
     </w:p>
     <w:p>
@@ -1732,7 +1732,7 @@
         <w:ind w:start="17.70pt" w:hanging="17.70pt"/>
       </w:pPr>
       <w:r>
-        <w:t xml:space="preserve">M. Voggenreiter, F. Angermeir, F. Moyón, U. Schöpp, and P. Bonvin, “Automated Security Findings Management: A Case Study in Industrial DevOps,” in </w:t>
+        <w:t xml:space="preserve">M. Voggenreiter, F. Angermeir, F. Moyón, U. Schöpp, and P. Bonvin, “Automated security findings management: A case study in industrial DevOps,” in </w:t>
       </w:r>
       <w:r>
         <w:rPr>
@@ -1742,7 +1742,10 @@
         <w:t>Proc. 46th Int. Conf. Software Engineering: Software Engineering in Practice (ICSE-SEIP)</w:t>
       </w:r>
       <w:r>
-        <w:t>, Apr. 2024, doi: 10.1145/3639477.3639744.</w:t>
+        <w:t>, Apr. 2024</w:t>
+      </w:r>
+      <w:r>
+        <w:t>.</w:t>
       </w:r>
     </w:p>
     <w:p>
@@ -1751,7 +1754,7 @@
         <w:ind w:start="17.70pt" w:hanging="17.70pt"/>
       </w:pPr>
       <w:r>
-        <w:t xml:space="preserve">A. Nayanajith and R. Wickramarachchi, “Challenges Affecting the Successful Adoption of DevOps Practices: A Systematic Literature Review,” in </w:t>
+        <w:t xml:space="preserve">A. Nayanajith and R. Wickramarachchi, “Challenges affecting the successful adoption of DevOps practices: A systematic literature review,” in </w:t>
       </w:r>
       <w:r>
         <w:rPr>
@@ -1761,7 +1764,10 @@
         <w:t>Proc. 4th Int. Conf. Advanced Research in Computing (ICARC)</w:t>
       </w:r>
       <w:r>
-        <w:t>, 2024, doi: 10.1109/ICARC61713.2024.10499735.</w:t>
+        <w:t>, 2024</w:t>
+      </w:r>
+      <w:r>
+        <w:t>.</w:t>
       </w:r>
     </w:p>
     <w:p>
@@ -1770,17 +1776,30 @@
         <w:ind w:start="17.70pt" w:hanging="17.70pt"/>
       </w:pPr>
       <w:r>
-        <w:t xml:space="preserve">N. Dinh, V. T. Hoang, B. N. Van, T. H. Huong, H. D. T. Hong, H. N. Trung, and K. T. Trung, “Enhancing Smart Contract Security Through DevSecOps: An Adaptive Approach for Vulnerability Detection,” </w:t>
+        <w:t xml:space="preserve">N. Dinh </w:t>
       </w:r>
       <w:r>
         <w:rPr>
           <w:i/>
           <w:iCs/>
         </w:rPr>
+        <w:t>et al.</w:t>
+      </w:r>
+      <w:r>
+        <w:t xml:space="preserve">, “Enhancing smart contract security through DevSecOps: An adaptive approach for vulnerability detection,” </w:t>
+      </w:r>
+      <w:r>
+        <w:rPr>
+          <w:i/>
+          <w:iCs/>
+        </w:rPr>
         <w:t>IEEE Access</w:t>
       </w:r>
       <w:r>
-        <w:t>, vol. 13, pp. 159454–159520, 2025, doi: 10.1109/ACCESS.2025.3606572.</w:t>
+        <w:t>, vol. 13, pp. 159454–159520, 2025</w:t>
+      </w:r>
+      <w:r>
+        <w:t>.</w:t>
       </w:r>
     </w:p>
     <w:p>
@@ -1789,17 +1808,30 @@
         <w:ind w:start="17.70pt" w:hanging="17.70pt"/>
       </w:pPr>
       <w:r>
-        <w:t xml:space="preserve">R. Ashtagi, Y. Bhalerao, C. Belani, P. Bhalerao, and A. Chawle, “Building Resilient CI/CD Pipelines: A DevOps Security-First Framework,” in </w:t>
+        <w:t xml:space="preserve">R. Ashtagi </w:t>
       </w:r>
       <w:r>
         <w:rPr>
           <w:i/>
           <w:iCs/>
         </w:rPr>
-        <w:t>Proc. 2025 Int. Conf. Computational, Communication and Information Technology (ICCCIT)</w:t>
-      </w:r>
-      <w:r>
-        <w:t>, 2025, doi: 10.1109/ICCCIT62592.2025.10927871.</w:t>
+        <w:t>et al.</w:t>
+      </w:r>
+      <w:r>
+        <w:t xml:space="preserve">, “Building resilient CI/CD pipelines: A DevOps security-first framework,” in </w:t>
+      </w:r>
+      <w:r>
+        <w:rPr>
+          <w:i/>
+          <w:iCs/>
+        </w:rPr>
+        <w:t>Proc. Int. Conf. Computational, Communication and Information Technology (ICCCIT)</w:t>
+      </w:r>
+      <w:r>
+        <w:t>, 2025</w:t>
+      </w:r>
+      <w:r>
+        <w:t>.</w:t>
       </w:r>
     </w:p>
     <w:p>
@@ -1808,7 +1840,7 @@
         <w:ind w:start="17.70pt" w:hanging="17.70pt"/>
       </w:pPr>
       <w:r>
-        <w:t xml:space="preserve">R. C. B. Ramos and S. G. Yoo, “Cybersecurity in DevOps Environments: A Systematic Literature Review,” </w:t>
+        <w:t xml:space="preserve">R. C. B. Ramos and S. G. Yoo, “Cybersecurity in DevOps environments: A systematic literature review,” </w:t>
       </w:r>
       <w:r>
         <w:rPr>
@@ -1818,7 +1850,10 @@
         <w:t>IEEE Access</w:t>
       </w:r>
       <w:r>
-        <w:t>, vol. 13, pp. 191959–191980, 2025, doi: 10.1109/ACCESS.2025.3582892.</w:t>
+        <w:t>, vol. 13, pp. 191959–191980, 2025</w:t>
+      </w:r>
+      <w:r>
+        <w:t>.</w:t>
       </w:r>
     </w:p>
     <w:p>
@@ -1827,17 +1862,30 @@
         <w:ind w:start="17.70pt" w:hanging="17.70pt"/>
       </w:pPr>
       <w:r>
-        <w:t xml:space="preserve">S. A. Ruk, Y. Mahmood, A. Azmi, N. F. M. Azmi, and S. Gul, “Effort Estimation in Agile and DevOps: A Systematic Literature Review of Stakeholder Dissatisfaction,” </w:t>
+        <w:t xml:space="preserve">S. A. Ruk </w:t>
       </w:r>
       <w:r>
         <w:rPr>
           <w:i/>
           <w:iCs/>
         </w:rPr>
+        <w:t>et al.</w:t>
+      </w:r>
+      <w:r>
+        <w:t xml:space="preserve">, “Effort estimation in Agile and DevOps: A systematic literature review of stakeholder dissatisfaction,” </w:t>
+      </w:r>
+      <w:r>
+        <w:rPr>
+          <w:i/>
+          <w:iCs/>
+        </w:rPr>
         <w:t>IEEE Access</w:t>
       </w:r>
       <w:r>
-        <w:t>, vol. 13, pp. 167925–167960, 2025, doi: 10.1109/ACCESS.2025.3600321.</w:t>
+        <w:t>, vol. 13, pp. 167925–167960, 2025</w:t>
+      </w:r>
+      <w:r>
+        <w:t>.</w:t>
       </w:r>
     </w:p>
     <w:p>
@@ -1846,7 +1894,7 @@
         <w:ind w:start="17.70pt" w:hanging="17.70pt"/>
       </w:pPr>
       <w:r>
-        <w:t xml:space="preserve">N. S, P. Manja, P. Mathur, and P. B. Honnavalli, “Extensive Review of Threat Models for DevSecOps,” </w:t>
+        <w:t xml:space="preserve">N. S, P. Manja, P. Mathur, and P. B. Honnavalli, “Extensive review of threat models for DevSecOps,” </w:t>
       </w:r>
       <w:r>
         <w:rPr>
@@ -1856,7 +1904,10 @@
         <w:t>IEEE Access</w:t>
       </w:r>
       <w:r>
-        <w:t>, vol. 13, pp. 45252–45274, 2025, doi: 10.1109/ACCESS.2025.3547932.</w:t>
+        <w:t>, vol. 13, pp. 45252–45274, 2025</w:t>
+      </w:r>
+      <w:r>
+        <w:t>.</w:t>
       </w:r>
     </w:p>
     <w:p>
@@ -1865,7 +1916,7 @@
         <w:ind w:start="17.70pt" w:hanging="17.70pt"/>
       </w:pPr>
       <w:r>
-        <w:t xml:space="preserve">M. A. Akbar and A. A. Alsanad, “Empirical Investigation of Key Enablers for Secure DevOps Practices,” </w:t>
+        <w:t xml:space="preserve">M. A. Akbar and A. A. Alsanad, “Empirical investigation of key enablers for secure DevOps practices,” </w:t>
       </w:r>
       <w:r>
         <w:rPr>
@@ -1875,7 +1926,10 @@
         <w:t>IEEE Access</w:t>
       </w:r>
       <w:r>
-        <w:t>, vol. 13, pp. 43698–43710, 2025, doi: 10.1109/ACCESS.2025.3549183.</w:t>
+        <w:t>, vol. 13, pp. 43698–43710, 2025</w:t>
+      </w:r>
+      <w:r>
+        <w:t>.</w:t>
       </w:r>
     </w:p>
     <w:p>
@@ -1891,17 +1945,30 @@
         </w:sectPr>
       </w:pPr>
       <w:r>
-        <w:t xml:space="preserve">J. Ababneh, E. Y. A. Al-Nsour, A. Al-Shaikh, M. R. Al-Mousa, A. Al-Zabin, M. Asassfeh, and H. Abualese, “Enhancing DevOps Continuous Monitoring Phase: Hybrid Intrusion Detection and Ensemble Learning System (HIDELS),” </w:t>
+        <w:t xml:space="preserve">J. Ababneh </w:t>
       </w:r>
       <w:r>
         <w:rPr>
           <w:i/>
           <w:iCs/>
         </w:rPr>
+        <w:t>et al.</w:t>
+      </w:r>
+      <w:r>
+        <w:t xml:space="preserve">, “Enhancing DevOps continuous monitoring phase: Hybrid intrusion detection and ensemble learning system,” </w:t>
+      </w:r>
+      <w:r>
+        <w:rPr>
+          <w:i/>
+          <w:iCs/>
+        </w:rPr>
         <w:t>IEEE Access</w:t>
       </w:r>
       <w:r>
-        <w:t>, vol. 14, pp. 4733–4755, 2026, doi: 10.1109/ACCESS.2026.3650793.</w:t>
+        <w:t>, vol. 14, pp. 4733–4755, 2026</w:t>
+      </w:r>
+      <w:r>
+        <w:t>.</w:t>
       </w:r>
     </w:p>
     <w:p>

</xml_diff>